<commit_message>
refs #16813 - [TECH] Mise à jour jour de l'artefact à partir de Detsala
</commit_message>
<xml_diff>
--- a/xaf-archetype/src/main/resources/archetype-resources/__rootArtifactId__-backserver/src/main/resources/pdf/DemandeRefusee.docx
+++ b/xaf-archetype/src/main/resources/archetype-resources/__rootArtifactId__-backserver/src/main/resources/pdf/DemandeRefusee.docx
@@ -6,7 +6,7 @@
       <w:tblPr>
         <w:tblStyle w:val="Grilledutableau"/>
         <w:tblW w:w="0" w:type="auto"/>
-        <w:tblInd w:w="6374" w:type="dxa"/>
+        <w:tblInd w:w="6232" w:type="dxa"/>
         <w:tblBorders>
           <w:top w:val="none" w:sz="0" w:space="0" w:color="auto"/>
           <w:left w:val="none" w:sz="0" w:space="0" w:color="auto"/>
@@ -18,30 +18,21 @@
         <w:tblLook w:val="04A0" w:firstRow="1" w:lastRow="0" w:firstColumn="1" w:lastColumn="0" w:noHBand="0" w:noVBand="1"/>
       </w:tblPr>
       <w:tblGrid>
-        <w:gridCol w:w="4952"/>
+        <w:gridCol w:w="5665"/>
       </w:tblGrid>
       <w:tr>
-        <w:trPr>
-          <w:trHeight w:val="422"/>
-        </w:trPr>
         <w:tc>
           <w:tcPr>
-            <w:tcW w:w="4952" w:type="dxa"/>
-            <w:hideMark/>
+            <w:tcW w:w="5665" w:type="dxa"/>
           </w:tcPr>
           <w:p>
             <w:pPr>
               <w:spacing w:after="200" w:line="276" w:lineRule="auto"/>
-              <w:jc w:val="both"/>
-              <w:rPr>
-                <w:lang w:eastAsia="ja-JP"/>
-              </w:rPr>
             </w:pPr>
             <w:r>
               <w:rPr>
                 <w:sz w:val="24"/>
                 <w:szCs w:val="24"/>
-                <w:lang w:eastAsia="ja-JP"/>
               </w:rPr>
               <w:t xml:space="preserve">Monaco, le </w:t>
             </w:r>
@@ -49,7 +40,6 @@
               <w:rPr>
                 <w:sz w:val="24"/>
                 <w:szCs w:val="24"/>
-                <w:lang w:eastAsia="ja-JP"/>
               </w:rPr>
               <w:fldChar w:fldCharType="begin"/>
             </w:r>
@@ -57,7 +47,6 @@
               <w:rPr>
                 <w:sz w:val="24"/>
                 <w:szCs w:val="24"/>
-                <w:lang w:eastAsia="ja-JP"/>
               </w:rPr>
               <w:instrText xml:space="preserve"> MERGEFIELD  $dateCourante  \* MERGEFORMAT </w:instrText>
             </w:r>
@@ -65,7 +54,6 @@
               <w:rPr>
                 <w:sz w:val="24"/>
                 <w:szCs w:val="24"/>
-                <w:lang w:eastAsia="ja-JP"/>
               </w:rPr>
               <w:fldChar w:fldCharType="separate"/>
             </w:r>
@@ -74,7 +62,6 @@
                 <w:noProof/>
                 <w:sz w:val="24"/>
                 <w:szCs w:val="24"/>
-                <w:lang w:eastAsia="ja-JP"/>
               </w:rPr>
               <w:t>«$dateCourante»</w:t>
             </w:r>
@@ -82,7 +69,6 @@
               <w:rPr>
                 <w:sz w:val="24"/>
                 <w:szCs w:val="24"/>
-                <w:lang w:eastAsia="ja-JP"/>
               </w:rPr>
               <w:fldChar w:fldCharType="end"/>
             </w:r>
@@ -97,18 +83,15 @@
               <w:autoSpaceDN w:val="0"/>
               <w:adjustRightInd w:val="0"/>
               <w:ind w:right="1134"/>
-              <w:jc w:val="both"/>
-              <w:rPr>
-                <w:sz w:val="24"/>
-                <w:szCs w:val="24"/>
-                <w:lang w:eastAsia="ja-JP"/>
+              <w:rPr>
+                <w:sz w:val="24"/>
+                <w:szCs w:val="24"/>
               </w:rPr>
             </w:pPr>
             <w:r>
               <w:rPr>
                 <w:sz w:val="24"/>
                 <w:szCs w:val="24"/>
-                <w:lang w:eastAsia="ja-JP"/>
               </w:rPr>
               <w:fldChar w:fldCharType="begin"/>
             </w:r>
@@ -116,7 +99,6 @@
               <w:rPr>
                 <w:sz w:val="24"/>
                 <w:szCs w:val="24"/>
-                <w:lang w:eastAsia="ja-JP"/>
               </w:rPr>
               <w:instrText xml:space="preserve"> MERGEFIELD  $raisonSociale  \* MERGEFORMAT </w:instrText>
             </w:r>
@@ -124,7 +106,6 @@
               <w:rPr>
                 <w:sz w:val="24"/>
                 <w:szCs w:val="24"/>
-                <w:lang w:eastAsia="ja-JP"/>
               </w:rPr>
               <w:fldChar w:fldCharType="separate"/>
             </w:r>
@@ -133,7 +114,6 @@
                 <w:noProof/>
                 <w:sz w:val="24"/>
                 <w:szCs w:val="24"/>
-                <w:lang w:eastAsia="ja-JP"/>
               </w:rPr>
               <w:t>«$raisonSociale»</w:t>
             </w:r>
@@ -141,7 +121,6 @@
               <w:rPr>
                 <w:sz w:val="24"/>
                 <w:szCs w:val="24"/>
-                <w:lang w:eastAsia="ja-JP"/>
               </w:rPr>
               <w:fldChar w:fldCharType="end"/>
             </w:r>
@@ -156,18 +135,14 @@
               <w:autoSpaceDN w:val="0"/>
               <w:adjustRightInd w:val="0"/>
               <w:ind w:right="1134"/>
-              <w:jc w:val="both"/>
-              <w:rPr>
-                <w:sz w:val="24"/>
-                <w:szCs w:val="24"/>
-                <w:lang w:eastAsia="ja-JP"/>
+              <w:rPr>
+                <w:lang w:val="en-US"/>
               </w:rPr>
             </w:pPr>
             <w:r>
               <w:rPr>
                 <w:sz w:val="24"/>
                 <w:szCs w:val="24"/>
-                <w:lang w:eastAsia="ja-JP"/>
               </w:rPr>
               <w:fldChar w:fldCharType="begin"/>
             </w:r>
@@ -175,15 +150,13 @@
               <w:rPr>
                 <w:sz w:val="24"/>
                 <w:szCs w:val="24"/>
-                <w:lang w:eastAsia="ja-JP"/>
-              </w:rPr>
-              <w:instrText xml:space="preserve"> MERGEFIELD  $nomCompletUsager  \* MERGEFORMAT </w:instrText>
-            </w:r>
-            <w:r>
-              <w:rPr>
-                <w:sz w:val="24"/>
-                <w:szCs w:val="24"/>
-                <w:lang w:eastAsia="ja-JP"/>
+              </w:rPr>
+              <w:instrText xml:space="preserve"> MERGEFIELD  $adresseComplete  \* MERGEFORMAT </w:instrText>
+            </w:r>
+            <w:r>
+              <w:rPr>
+                <w:sz w:val="24"/>
+                <w:szCs w:val="24"/>
               </w:rPr>
               <w:fldChar w:fldCharType="separate"/>
             </w:r>
@@ -192,17 +165,21 @@
                 <w:noProof/>
                 <w:sz w:val="24"/>
                 <w:szCs w:val="24"/>
-                <w:lang w:eastAsia="ja-JP"/>
-              </w:rPr>
-              <w:t>«$nomCompletUsager»</w:t>
-            </w:r>
-            <w:r>
-              <w:rPr>
-                <w:sz w:val="24"/>
-                <w:szCs w:val="24"/>
-                <w:lang w:eastAsia="ja-JP"/>
+              </w:rPr>
+              <w:t>«$adresseComplete»</w:t>
+            </w:r>
+            <w:r>
+              <w:rPr>
+                <w:sz w:val="24"/>
+                <w:szCs w:val="24"/>
               </w:rPr>
               <w:fldChar w:fldCharType="end"/>
+            </w:r>
+            <w:r>
+              <w:rPr>
+                <w:lang w:val="en-US"/>
+              </w:rPr>
+              <w:t xml:space="preserve"> </w:t>
             </w:r>
           </w:p>
           <w:p>
@@ -215,35 +192,22 @@
               <w:autoSpaceDN w:val="0"/>
               <w:adjustRightInd w:val="0"/>
               <w:ind w:right="1134"/>
-              <w:jc w:val="both"/>
-              <w:rPr>
-                <w:sz w:val="24"/>
-                <w:szCs w:val="24"/>
-                <w:lang w:eastAsia="ja-JP"/>
+              <w:rPr>
+                <w:sz w:val="24"/>
+                <w:szCs w:val="24"/>
               </w:rPr>
             </w:pPr>
             <w:r>
-              <w:rPr>
-                <w:sz w:val="24"/>
-                <w:szCs w:val="24"/>
-                <w:lang w:eastAsia="ja-JP"/>
-              </w:rPr>
               <w:fldChar w:fldCharType="begin"/>
             </w:r>
             <w:r>
               <w:rPr>
                 <w:sz w:val="24"/>
                 <w:szCs w:val="24"/>
-                <w:lang w:eastAsia="ja-JP"/>
-              </w:rPr>
-              <w:instrText xml:space="preserve"> MERGEFIELD  $adresseLigne1  \* MERGEFORMAT </w:instrText>
-            </w:r>
-            <w:r>
-              <w:rPr>
-                <w:sz w:val="24"/>
-                <w:szCs w:val="24"/>
-                <w:lang w:eastAsia="ja-JP"/>
-              </w:rPr>
+              </w:rPr>
+              <w:instrText xml:space="preserve"> MERGEFIELD  $codePostal  \* MERGEFORMAT </w:instrText>
+            </w:r>
+            <w:r>
               <w:fldChar w:fldCharType="separate"/>
             </w:r>
             <w:r>
@@ -251,41 +215,61 @@
                 <w:noProof/>
                 <w:sz w:val="24"/>
                 <w:szCs w:val="24"/>
-                <w:lang w:eastAsia="ja-JP"/>
-              </w:rPr>
-              <w:t>«$adresseLigne1»</w:t>
-            </w:r>
-            <w:r>
-              <w:rPr>
-                <w:sz w:val="24"/>
-                <w:szCs w:val="24"/>
-                <w:lang w:eastAsia="ja-JP"/>
-              </w:rPr>
+              </w:rPr>
+              <w:t>«$codePostal»</w:t>
+            </w:r>
+            <w:r>
+              <w:fldChar w:fldCharType="end"/>
+            </w:r>
+            <w:r>
+              <w:rPr>
+                <w:sz w:val="24"/>
+                <w:szCs w:val="24"/>
+              </w:rPr>
+              <w:t xml:space="preserve"> </w:t>
+            </w:r>
+            <w:r>
+              <w:fldChar w:fldCharType="begin"/>
+            </w:r>
+            <w:r>
+              <w:rPr>
+                <w:sz w:val="24"/>
+                <w:szCs w:val="24"/>
+              </w:rPr>
+              <w:instrText xml:space="preserve"> MERGEFIELD  $ville  \* MERGEFORMAT </w:instrText>
+            </w:r>
+            <w:r>
+              <w:fldChar w:fldCharType="separate"/>
+            </w:r>
+            <w:r>
+              <w:rPr>
+                <w:noProof/>
+                <w:sz w:val="24"/>
+                <w:szCs w:val="24"/>
+              </w:rPr>
+              <w:t>«$ville»</w:t>
+            </w:r>
+            <w:r>
               <w:fldChar w:fldCharType="end"/>
             </w:r>
           </w:p>
           <w:p>
             <w:pPr>
               <w:widowControl w:val="0"/>
-              <w:tabs>
-                <w:tab w:val="left" w:pos="5670"/>
-              </w:tabs>
               <w:autoSpaceDE w:val="0"/>
               <w:autoSpaceDN w:val="0"/>
               <w:adjustRightInd w:val="0"/>
               <w:ind w:right="1134"/>
-              <w:jc w:val="both"/>
-              <w:rPr>
-                <w:sz w:val="24"/>
-                <w:szCs w:val="24"/>
-                <w:lang w:eastAsia="ja-JP"/>
+              <w:rPr>
+                <w:rFonts w:ascii="Calibri" w:hAnsi="Calibri"/>
+                <w:sz w:val="24"/>
+                <w:szCs w:val="24"/>
               </w:rPr>
             </w:pPr>
             <w:r>
               <w:rPr>
                 <w:sz w:val="24"/>
                 <w:szCs w:val="24"/>
-                <w:lang w:eastAsia="ja-JP"/>
               </w:rPr>
               <w:fldChar w:fldCharType="begin"/>
             </w:r>
@@ -293,15 +277,13 @@
               <w:rPr>
                 <w:sz w:val="24"/>
                 <w:szCs w:val="24"/>
-                <w:lang w:eastAsia="ja-JP"/>
-              </w:rPr>
-              <w:instrText xml:space="preserve"> MERGEFIELD  $adresseLigne2  \* MERGEFORMAT </w:instrText>
-            </w:r>
-            <w:r>
-              <w:rPr>
-                <w:sz w:val="24"/>
-                <w:szCs w:val="24"/>
-                <w:lang w:eastAsia="ja-JP"/>
+              </w:rPr>
+              <w:instrText xml:space="preserve"> MERGEFIELD  $pays  \* MERGEFORMAT </w:instrText>
+            </w:r>
+            <w:r>
+              <w:rPr>
+                <w:sz w:val="24"/>
+                <w:szCs w:val="24"/>
               </w:rPr>
               <w:fldChar w:fldCharType="separate"/>
             </w:r>
@@ -310,185 +292,19 @@
                 <w:noProof/>
                 <w:sz w:val="24"/>
                 <w:szCs w:val="24"/>
-                <w:lang w:eastAsia="ja-JP"/>
-              </w:rPr>
-              <w:t>«$adresseLigne2»</w:t>
-            </w:r>
-            <w:r>
-              <w:rPr>
-                <w:sz w:val="24"/>
-                <w:szCs w:val="24"/>
-                <w:lang w:eastAsia="ja-JP"/>
+              </w:rPr>
+              <w:t>«$pays»</w:t>
+            </w:r>
+            <w:r>
+              <w:rPr>
+                <w:noProof/>
+                <w:sz w:val="24"/>
+                <w:szCs w:val="24"/>
               </w:rPr>
               <w:fldChar w:fldCharType="end"/>
             </w:r>
-          </w:p>
-          <w:p>
-            <w:pPr>
-              <w:widowControl w:val="0"/>
-              <w:tabs>
-                <w:tab w:val="left" w:pos="5670"/>
-              </w:tabs>
-              <w:autoSpaceDE w:val="0"/>
-              <w:autoSpaceDN w:val="0"/>
-              <w:adjustRightInd w:val="0"/>
-              <w:ind w:right="1134"/>
-              <w:jc w:val="both"/>
-              <w:rPr>
-                <w:sz w:val="24"/>
-                <w:szCs w:val="24"/>
-                <w:lang w:eastAsia="ja-JP"/>
-              </w:rPr>
-            </w:pPr>
-            <w:r>
-              <w:rPr>
-                <w:sz w:val="24"/>
-                <w:szCs w:val="24"/>
-                <w:lang w:eastAsia="ja-JP"/>
-              </w:rPr>
-              <w:fldChar w:fldCharType="begin"/>
-            </w:r>
-            <w:r>
-              <w:rPr>
-                <w:sz w:val="24"/>
-                <w:szCs w:val="24"/>
-                <w:lang w:eastAsia="ja-JP"/>
-              </w:rPr>
-              <w:instrText xml:space="preserve"> MERGEFIELD  $adresseLigne3  \* MERGEFORMAT </w:instrText>
-            </w:r>
-            <w:r>
-              <w:rPr>
-                <w:sz w:val="24"/>
-                <w:szCs w:val="24"/>
-                <w:lang w:eastAsia="ja-JP"/>
-              </w:rPr>
-              <w:fldChar w:fldCharType="separate"/>
-            </w:r>
-            <w:r>
-              <w:rPr>
-                <w:noProof/>
-                <w:sz w:val="24"/>
-                <w:szCs w:val="24"/>
-                <w:lang w:eastAsia="ja-JP"/>
-              </w:rPr>
-              <w:t>«$adresseLigne3»</w:t>
-            </w:r>
-            <w:r>
-              <w:rPr>
-                <w:sz w:val="24"/>
-                <w:szCs w:val="24"/>
-                <w:lang w:eastAsia="ja-JP"/>
-              </w:rPr>
-              <w:fldChar w:fldCharType="end"/>
-            </w:r>
-          </w:p>
-          <w:p>
-            <w:pPr>
-              <w:widowControl w:val="0"/>
-              <w:tabs>
-                <w:tab w:val="left" w:pos="5670"/>
-              </w:tabs>
-              <w:autoSpaceDE w:val="0"/>
-              <w:autoSpaceDN w:val="0"/>
-              <w:adjustRightInd w:val="0"/>
-              <w:ind w:right="1134"/>
-              <w:jc w:val="both"/>
-              <w:rPr>
-                <w:sz w:val="24"/>
-                <w:szCs w:val="24"/>
-                <w:lang w:eastAsia="ja-JP"/>
-              </w:rPr>
-            </w:pPr>
-            <w:r>
-              <w:rPr>
-                <w:sz w:val="24"/>
-                <w:szCs w:val="24"/>
-                <w:lang w:eastAsia="ja-JP"/>
-              </w:rPr>
-              <w:fldChar w:fldCharType="begin"/>
-            </w:r>
-            <w:r>
-              <w:rPr>
-                <w:sz w:val="24"/>
-                <w:szCs w:val="24"/>
-                <w:lang w:eastAsia="ja-JP"/>
-              </w:rPr>
-              <w:instrText xml:space="preserve"> MERGEFIELD  $codePostal  \* MERGEFORMAT </w:instrText>
-            </w:r>
-            <w:r>
-              <w:rPr>
-                <w:sz w:val="24"/>
-                <w:szCs w:val="24"/>
-                <w:lang w:eastAsia="ja-JP"/>
-              </w:rPr>
-              <w:fldChar w:fldCharType="separate"/>
-            </w:r>
-            <w:r>
-              <w:rPr>
-                <w:noProof/>
-                <w:sz w:val="24"/>
-                <w:szCs w:val="24"/>
-                <w:lang w:eastAsia="ja-JP"/>
-              </w:rPr>
-              <w:t>«$codePostal»</w:t>
-            </w:r>
-            <w:r>
-              <w:rPr>
-                <w:sz w:val="24"/>
-                <w:szCs w:val="24"/>
-                <w:lang w:eastAsia="ja-JP"/>
-              </w:rPr>
-              <w:fldChar w:fldCharType="end"/>
-            </w:r>
-            <w:r>
-              <w:rPr>
-                <w:sz w:val="24"/>
-                <w:szCs w:val="24"/>
-                <w:lang w:eastAsia="ja-JP"/>
-              </w:rPr>
-              <w:t xml:space="preserve"> </w:t>
-            </w:r>
-            <w:r>
-              <w:rPr>
-                <w:sz w:val="24"/>
-                <w:szCs w:val="24"/>
-                <w:lang w:eastAsia="ja-JP"/>
-              </w:rPr>
-              <w:fldChar w:fldCharType="begin"/>
-            </w:r>
-            <w:r>
-              <w:rPr>
-                <w:sz w:val="24"/>
-                <w:szCs w:val="24"/>
-                <w:lang w:eastAsia="ja-JP"/>
-              </w:rPr>
-              <w:instrText xml:space="preserve"> MERGEFIELD  $ville  \* MERGEFORMAT </w:instrText>
-            </w:r>
-            <w:r>
-              <w:rPr>
-                <w:sz w:val="24"/>
-                <w:szCs w:val="24"/>
-                <w:lang w:eastAsia="ja-JP"/>
-              </w:rPr>
-              <w:fldChar w:fldCharType="separate"/>
-            </w:r>
-            <w:r>
-              <w:rPr>
-                <w:noProof/>
-                <w:sz w:val="24"/>
-                <w:szCs w:val="24"/>
-                <w:lang w:eastAsia="ja-JP"/>
-              </w:rPr>
-              <w:t>«$ville»</w:t>
-            </w:r>
-            <w:r>
-              <w:rPr>
-                <w:sz w:val="24"/>
-                <w:szCs w:val="24"/>
-                <w:lang w:eastAsia="ja-JP"/>
-              </w:rPr>
-              <w:fldChar w:fldCharType="end"/>
-            </w:r>
+            <w:bookmarkStart w:id="0" w:name="_GoBack"/>
+            <w:bookmarkEnd w:id="0"/>
           </w:p>
         </w:tc>
       </w:tr>
@@ -496,21 +312,17 @@
     <w:p>
       <w:pPr>
         <w:widowControl w:val="0"/>
-        <w:tabs>
-          <w:tab w:val="left" w:pos="5670"/>
-        </w:tabs>
         <w:autoSpaceDE w:val="0"/>
         <w:autoSpaceDN w:val="0"/>
         <w:adjustRightInd w:val="0"/>
-        <w:ind w:left="4962" w:right="1134" w:firstLine="1417"/>
+        <w:ind w:left="5670" w:right="1134" w:firstLine="709"/>
         <w:jc w:val="both"/>
         <w:rPr>
+          <w:rFonts w:ascii="Calibri" w:hAnsi="Calibri"/>
           <w:sz w:val="24"/>
           <w:szCs w:val="24"/>
         </w:rPr>
       </w:pPr>
-      <w:bookmarkStart w:id="0" w:name="_GoBack"/>
-      <w:bookmarkEnd w:id="0"/>
     </w:p>
     <w:p>
       <w:pPr>
@@ -518,166 +330,9 @@
         <w:autoSpaceDE w:val="0"/>
         <w:autoSpaceDN w:val="0"/>
         <w:adjustRightInd w:val="0"/>
-        <w:ind w:left="1254" w:right="1134" w:firstLine="164"/>
-        <w:rPr>
-          <w:sz w:val="24"/>
-        </w:rPr>
-      </w:pPr>
-      <w:r>
-        <w:rPr>
-          <w:sz w:val="24"/>
-          <w:szCs w:val="24"/>
-        </w:rPr>
-        <w:t xml:space="preserve">N° de la demande : </w:t>
-      </w:r>
-      <w:r>
-        <w:rPr>
-          <w:sz w:val="24"/>
-        </w:rPr>
-        <w:fldChar w:fldCharType="begin"/>
-      </w:r>
-      <w:r>
-        <w:rPr>
-          <w:sz w:val="24"/>
-        </w:rPr>
-        <w:instrText xml:space="preserve"> MERGEFIELD  $identifiant  \* MERGEFORMAT </w:instrText>
-      </w:r>
-      <w:r>
-        <w:rPr>
-          <w:sz w:val="24"/>
-        </w:rPr>
-        <w:fldChar w:fldCharType="separate"/>
-      </w:r>
-      <w:r>
-        <w:rPr>
-          <w:noProof/>
-          <w:sz w:val="24"/>
-        </w:rPr>
-        <w:t>«$identifiant»</w:t>
-      </w:r>
-      <w:r>
-        <w:rPr>
-          <w:sz w:val="24"/>
-        </w:rPr>
-        <w:fldChar w:fldCharType="end"/>
-      </w:r>
-    </w:p>
-    <w:p>
-      <w:pPr>
-        <w:widowControl w:val="0"/>
-        <w:autoSpaceDE w:val="0"/>
-        <w:autoSpaceDN w:val="0"/>
-        <w:adjustRightInd w:val="0"/>
-        <w:ind w:left="1254" w:right="1134" w:firstLine="164"/>
-        <w:rPr>
-          <w:sz w:val="24"/>
-          <w:szCs w:val="24"/>
-        </w:rPr>
-      </w:pPr>
-      <w:r>
-        <w:rPr>
-          <w:sz w:val="24"/>
-        </w:rPr>
-        <w:t xml:space="preserve">Demande traitée par : </w:t>
-      </w:r>
-      <w:r>
-        <w:rPr>
-          <w:sz w:val="24"/>
-        </w:rPr>
-        <w:fldChar w:fldCharType="begin"/>
-      </w:r>
-      <w:r>
-        <w:rPr>
-          <w:sz w:val="24"/>
-        </w:rPr>
-        <w:instrText xml:space="preserve"> MERGEFIELD  $nomAgent  \* MERGEFORMAT </w:instrText>
-      </w:r>
-      <w:r>
-        <w:rPr>
-          <w:sz w:val="24"/>
-        </w:rPr>
-        <w:fldChar w:fldCharType="separate"/>
-      </w:r>
-      <w:r>
-        <w:rPr>
-          <w:noProof/>
-          <w:sz w:val="24"/>
-        </w:rPr>
-        <w:t>«$nomAgent»</w:t>
-      </w:r>
-      <w:r>
-        <w:rPr>
-          <w:sz w:val="24"/>
-        </w:rPr>
-        <w:fldChar w:fldCharType="end"/>
-      </w:r>
-      <w:r>
-        <w:rPr>
-          <w:sz w:val="24"/>
-        </w:rPr>
-        <w:t xml:space="preserve"> - Inspecteur du T</w:t>
-      </w:r>
-      <w:r>
-        <w:rPr>
-          <w:sz w:val="24"/>
-        </w:rPr>
-        <w:t>ravail</w:t>
-      </w:r>
-    </w:p>
-    <w:p>
-      <w:pPr>
-        <w:widowControl w:val="0"/>
-        <w:tabs>
-          <w:tab w:val="left" w:pos="1764"/>
-        </w:tabs>
-        <w:autoSpaceDE w:val="0"/>
-        <w:autoSpaceDN w:val="0"/>
-        <w:adjustRightInd w:val="0"/>
-        <w:ind w:left="1418" w:right="1134"/>
-        <w:jc w:val="both"/>
-        <w:rPr>
-          <w:sz w:val="24"/>
-          <w:szCs w:val="24"/>
-        </w:rPr>
-      </w:pPr>
-      <w:r>
-        <w:rPr>
-          <w:sz w:val="24"/>
-          <w:szCs w:val="24"/>
-        </w:rPr>
-        <w:t xml:space="preserve">Objet : </w:t>
-      </w:r>
-      <w:r>
-        <w:rPr>
-          <w:sz w:val="24"/>
-        </w:rPr>
-        <w:t xml:space="preserve">Votre demande de dérogation </w:t>
-      </w:r>
-      <w:r>
-        <w:rPr>
-          <w:sz w:val="24"/>
-        </w:rPr>
-        <w:t>relative aux jours fériés</w:t>
-      </w:r>
-      <w:r>
-        <w:rPr>
-          <w:sz w:val="24"/>
-        </w:rPr>
-        <w:t xml:space="preserve"> légaux</w:t>
-      </w:r>
-    </w:p>
-    <w:p>
-      <w:pPr>
-        <w:widowControl w:val="0"/>
-        <w:tabs>
-          <w:tab w:val="left" w:pos="1764"/>
-        </w:tabs>
-        <w:autoSpaceDE w:val="0"/>
-        <w:autoSpaceDN w:val="0"/>
-        <w:adjustRightInd w:val="0"/>
-        <w:ind w:left="1418" w:right="1134"/>
-        <w:jc w:val="both"/>
-        <w:rPr>
+        <w:ind w:left="1134" w:right="1134"/>
+        <w:rPr>
+          <w:rFonts w:ascii="Calibri" w:hAnsi="Calibri"/>
           <w:sz w:val="24"/>
           <w:szCs w:val="24"/>
         </w:rPr>
@@ -701,64 +356,17 @@
       </w:pPr>
       <w:r>
         <w:rPr>
-          <w:noProof/>
           <w:sz w:val="24"/>
           <w:szCs w:val="24"/>
         </w:rPr>
-        <w:fldChar w:fldCharType="begin"/>
-      </w:r>
-      <w:r>
-        <w:rPr>
-          <w:noProof/>
-          <w:sz w:val="24"/>
-          <w:szCs w:val="24"/>
-        </w:rPr>
-        <w:instrText xml:space="preserve"> MERGEFIELD  $titre  \* MERGEFORMAT </w:instrText>
-      </w:r>
-      <w:r>
-        <w:rPr>
-          <w:noProof/>
-          <w:sz w:val="24"/>
-          <w:szCs w:val="24"/>
-        </w:rPr>
-        <w:fldChar w:fldCharType="separate"/>
-      </w:r>
-      <w:r>
-        <w:rPr>
-          <w:noProof/>
-          <w:sz w:val="24"/>
-          <w:szCs w:val="24"/>
-        </w:rPr>
-        <w:t>«$titre»</w:t>
-      </w:r>
-      <w:r>
-        <w:rPr>
-          <w:noProof/>
-          <w:sz w:val="24"/>
-          <w:szCs w:val="24"/>
-        </w:rPr>
-        <w:fldChar w:fldCharType="end"/>
-      </w:r>
-      <w:r>
-        <w:rPr>
-          <w:noProof/>
-          <w:sz w:val="24"/>
-          <w:szCs w:val="24"/>
-        </w:rPr>
-        <w:t>,</w:t>
-      </w:r>
-    </w:p>
-    <w:p>
-      <w:pPr>
-        <w:tabs>
-          <w:tab w:val="left" w:pos="1764"/>
-        </w:tabs>
-        <w:ind w:left="1418" w:right="1134"/>
-        <w:jc w:val="both"/>
-        <w:rPr>
-          <w:sz w:val="24"/>
-        </w:rPr>
-      </w:pPr>
+        <w:t xml:space="preserve">Objet : </w:t>
+      </w:r>
+      <w:r>
+        <w:rPr>
+          <w:sz w:val="24"/>
+        </w:rPr>
+        <w:t>Autorisation de détachement</w:t>
+      </w:r>
     </w:p>
     <w:p>
       <w:pPr>
@@ -773,35 +381,104 @@
         <w:jc w:val="both"/>
         <w:rPr>
           <w:sz w:val="24"/>
+          <w:szCs w:val="24"/>
         </w:rPr>
       </w:pPr>
-      <w:r>
-        <w:rPr>
-          <w:sz w:val="24"/>
-          <w:szCs w:val="24"/>
-        </w:rPr>
-        <w:t xml:space="preserve">J’ai l’honneur par la présente, de faire suite à votre demande </w:t>
-      </w:r>
-      <w:r>
-        <w:rPr>
+    </w:p>
+    <w:p>
+      <w:pPr>
+        <w:tabs>
+          <w:tab w:val="left" w:pos="1764"/>
+        </w:tabs>
+        <w:ind w:left="1418" w:right="1134"/>
+        <w:jc w:val="both"/>
+        <w:rPr>
+          <w:sz w:val="24"/>
+        </w:rPr>
+      </w:pPr>
+      <w:r>
+        <w:rPr>
+          <w:sz w:val="24"/>
+        </w:rPr>
+        <w:t>Madame, Monsieur</w:t>
+      </w:r>
+      <w:r>
+        <w:rPr>
+          <w:sz w:val="24"/>
+        </w:rPr>
+        <w:t xml:space="preserve">, </w:t>
+      </w:r>
+    </w:p>
+    <w:p>
+      <w:pPr>
+        <w:widowControl w:val="0"/>
+        <w:tabs>
+          <w:tab w:val="left" w:pos="2127"/>
+          <w:tab w:val="left" w:pos="2268"/>
+        </w:tabs>
+        <w:autoSpaceDE w:val="0"/>
+        <w:autoSpaceDN w:val="0"/>
+        <w:adjustRightInd w:val="0"/>
+        <w:ind w:left="2127" w:right="1134"/>
+        <w:jc w:val="both"/>
+        <w:rPr>
+          <w:sz w:val="24"/>
+        </w:rPr>
+      </w:pPr>
+    </w:p>
+    <w:p>
+      <w:pPr>
+        <w:tabs>
+          <w:tab w:val="left" w:pos="1764"/>
+        </w:tabs>
+        <w:ind w:left="1418" w:right="1134"/>
+        <w:jc w:val="both"/>
+        <w:rPr>
+          <w:sz w:val="24"/>
+        </w:rPr>
+      </w:pPr>
+      <w:r>
+        <w:rPr>
+          <w:sz w:val="24"/>
+        </w:rPr>
+        <w:t>J'ai le regret de vous informer que votre demande</w:t>
+      </w:r>
+      <w:r>
+        <w:rPr>
+          <w:sz w:val="24"/>
+        </w:rPr>
+        <w:t xml:space="preserve"> de détachement</w:t>
+      </w:r>
+      <w:r>
+        <w:rPr>
+          <w:sz w:val="24"/>
+        </w:rPr>
+        <w:t xml:space="preserve"> </w:t>
+      </w:r>
+      <w:r>
+        <w:rPr>
+          <w:b/>
           <w:sz w:val="24"/>
         </w:rPr>
         <w:fldChar w:fldCharType="begin"/>
       </w:r>
       <w:r>
         <w:rPr>
+          <w:b/>
           <w:sz w:val="24"/>
         </w:rPr>
         <w:instrText xml:space="preserve"> MERGEFIELD  $identifiant  \* MERGEFORMAT </w:instrText>
       </w:r>
       <w:r>
         <w:rPr>
+          <w:b/>
           <w:sz w:val="24"/>
         </w:rPr>
         <w:fldChar w:fldCharType="separate"/>
       </w:r>
       <w:r>
         <w:rPr>
+          <w:b/>
           <w:noProof/>
           <w:sz w:val="24"/>
         </w:rPr>
@@ -809,65 +486,30 @@
       </w:r>
       <w:r>
         <w:rPr>
+          <w:b/>
           <w:sz w:val="24"/>
         </w:rPr>
         <w:fldChar w:fldCharType="end"/>
       </w:r>
       <w:r>
         <w:rPr>
-          <w:sz w:val="24"/>
-          <w:szCs w:val="24"/>
-        </w:rPr>
-        <w:t xml:space="preserve"> reçue le </w:t>
-      </w:r>
-      <w:r>
-        <w:rPr>
-          <w:sz w:val="24"/>
-          <w:szCs w:val="24"/>
-        </w:rPr>
-        <w:fldChar w:fldCharType="begin"/>
-      </w:r>
-      <w:r>
-        <w:rPr>
-          <w:sz w:val="24"/>
-          <w:szCs w:val="24"/>
-        </w:rPr>
-        <w:instrText xml:space="preserve"> MERGEFIELD  $dateReception  \* MERGEFORMAT </w:instrText>
-      </w:r>
-      <w:r>
-        <w:rPr>
-          <w:sz w:val="24"/>
-          <w:szCs w:val="24"/>
-        </w:rPr>
-        <w:fldChar w:fldCharType="separate"/>
-      </w:r>
-      <w:r>
-        <w:rPr>
-          <w:noProof/>
-          <w:sz w:val="24"/>
-          <w:szCs w:val="24"/>
-        </w:rPr>
-        <w:t>«$dateReception»</w:t>
-      </w:r>
-      <w:r>
-        <w:rPr>
-          <w:sz w:val="24"/>
-          <w:szCs w:val="24"/>
-        </w:rPr>
-        <w:fldChar w:fldCharType="end"/>
-      </w:r>
-      <w:r>
-        <w:rPr>
-          <w:sz w:val="24"/>
-          <w:szCs w:val="24"/>
-        </w:rPr>
-        <w:t xml:space="preserve">, par laquelle vous sollicitez de pouvoir bénéficier des dispositions </w:t>
-      </w:r>
-      <w:r>
-        <w:rPr>
-          <w:sz w:val="24"/>
-        </w:rPr>
-        <w:t>de l’article 7 de la Loi n. 800 du 18 février 1966 régissant la rémunération et les conditions de travail relatives aux jours fériés légaux.</w:t>
+          <w:b/>
+          <w:sz w:val="24"/>
+        </w:rPr>
+        <w:t>,</w:t>
+      </w:r>
+      <w:r>
+        <w:rPr>
+          <w:b/>
+          <w:sz w:val="24"/>
+        </w:rPr>
+        <w:t xml:space="preserve"> </w:t>
+      </w:r>
+      <w:r>
+        <w:rPr>
+          <w:sz w:val="24"/>
+        </w:rPr>
+        <w:t>ne peut obtenir une suite favorable.</w:t>
       </w:r>
     </w:p>
     <w:p>
@@ -881,6 +523,7 @@
         <w:ind w:left="1418" w:right="1134" w:firstLine="0"/>
         <w:rPr>
           <w:rFonts w:ascii="Times New Roman" w:hAnsi="Times New Roman"/>
+          <w:lang w:val="en-US"/>
         </w:rPr>
       </w:pPr>
       <w:r>
@@ -892,8 +535,9 @@
       <w:r>
         <w:rPr>
           <w:rFonts w:ascii="Times New Roman" w:hAnsi="Times New Roman"/>
-        </w:rPr>
-        <w:instrText xml:space="preserve"> MERGEFIELD  #if($StringUtils.isNotBlank($commentaire))  \* MERGEFORMAT </w:instrText>
+          <w:lang w:val="en-US"/>
+        </w:rPr>
+        <w:instrText xml:space="preserve"> MERGEFIELD  #if($StringUtils.isNotBlank($texteAEnvoyer))  \* MERGEFORMAT </w:instrText>
       </w:r>
       <w:r>
         <w:rPr>
@@ -905,8 +549,9 @@
         <w:rPr>
           <w:rFonts w:ascii="Times New Roman" w:hAnsi="Times New Roman"/>
           <w:noProof/>
-        </w:rPr>
-        <w:t>«#if($StringUtils.isNotBlank($commentaire»</w:t>
+          <w:lang w:val="en-US"/>
+        </w:rPr>
+        <w:t>«#if($StringUtils.isNotBlank($texteAEnvoy»</w:t>
       </w:r>
       <w:r>
         <w:rPr>
@@ -926,6 +571,7 @@
         <w:ind w:left="1418" w:right="1134" w:firstLine="0"/>
         <w:rPr>
           <w:rFonts w:ascii="Times New Roman" w:hAnsi="Times New Roman"/>
+          <w:lang w:val="en-US"/>
         </w:rPr>
       </w:pPr>
     </w:p>
@@ -940,6 +586,7 @@
         <w:ind w:left="1418" w:right="1134" w:firstLine="0"/>
         <w:rPr>
           <w:rFonts w:ascii="Times New Roman" w:hAnsi="Times New Roman"/>
+          <w:lang w:val="en-US"/>
         </w:rPr>
       </w:pPr>
       <w:r>
@@ -951,8 +598,9 @@
       <w:r>
         <w:rPr>
           <w:rFonts w:ascii="Times New Roman" w:hAnsi="Times New Roman"/>
-        </w:rPr>
-        <w:instrText xml:space="preserve"> MERGEFIELD  ${commentaire}  \* MERGEFORMAT </w:instrText>
+          <w:lang w:val="en-US"/>
+        </w:rPr>
+        <w:instrText xml:space="preserve"> MERGEFIELD  ${texteAEnvoyer}  \* MERGEFORMAT </w:instrText>
       </w:r>
       <w:r>
         <w:rPr>
@@ -964,8 +612,9 @@
         <w:rPr>
           <w:rFonts w:ascii="Times New Roman" w:hAnsi="Times New Roman"/>
           <w:noProof/>
-        </w:rPr>
-        <w:t>«${commentaire}»</w:t>
+          <w:lang w:val="en-US"/>
+        </w:rPr>
+        <w:t>«${texteAEnvoyer}»</w:t>
       </w:r>
       <w:r>
         <w:rPr>
@@ -982,6 +631,7 @@
       <w:r>
         <w:rPr>
           <w:rFonts w:ascii="Times New Roman" w:hAnsi="Times New Roman"/>
+          <w:lang w:val="en-US"/>
         </w:rPr>
         <w:instrText xml:space="preserve"> MERGEFIELD  #end  \* MERGEFORMAT </w:instrText>
       </w:r>
@@ -995,6 +645,7 @@
         <w:rPr>
           <w:rFonts w:ascii="Times New Roman" w:hAnsi="Times New Roman"/>
           <w:noProof/>
+          <w:lang w:val="en-US"/>
         </w:rPr>
         <w:t>«#end»</w:t>
       </w:r>
@@ -1010,10 +661,12 @@
         <w:tabs>
           <w:tab w:val="left" w:pos="1764"/>
         </w:tabs>
-        <w:ind w:left="1418" w:right="1134"/>
+        <w:ind w:right="1134"/>
         <w:jc w:val="both"/>
         <w:rPr>
           <w:sz w:val="24"/>
+          <w:szCs w:val="24"/>
+          <w:lang w:val="en-US"/>
         </w:rPr>
       </w:pPr>
     </w:p>
@@ -1032,65 +685,25 @@
         <w:rPr>
           <w:sz w:val="24"/>
         </w:rPr>
-        <w:t xml:space="preserve">Je vous prie </w:t>
-      </w:r>
-      <w:r>
-        <w:rPr>
-          <w:sz w:val="24"/>
-        </w:rPr>
-        <w:t>d’agréer,</w:t>
-      </w:r>
-      <w:r>
-        <w:rPr>
-          <w:sz w:val="24"/>
-        </w:rPr>
-        <w:t xml:space="preserve"> </w:t>
-      </w:r>
-      <w:r>
-        <w:rPr>
-          <w:noProof/>
-          <w:sz w:val="24"/>
-          <w:szCs w:val="24"/>
-        </w:rPr>
-        <w:fldChar w:fldCharType="begin"/>
-      </w:r>
-      <w:r>
-        <w:rPr>
-          <w:noProof/>
-          <w:sz w:val="24"/>
-          <w:szCs w:val="24"/>
-        </w:rPr>
-        <w:instrText xml:space="preserve"> MERGEFIELD  $titre  \* MERGEFORMAT </w:instrText>
-      </w:r>
-      <w:r>
-        <w:rPr>
-          <w:noProof/>
-          <w:sz w:val="24"/>
-          <w:szCs w:val="24"/>
-        </w:rPr>
-        <w:fldChar w:fldCharType="separate"/>
-      </w:r>
-      <w:r>
-        <w:rPr>
-          <w:noProof/>
-          <w:sz w:val="24"/>
-          <w:szCs w:val="24"/>
-        </w:rPr>
-        <w:t>«$titre»</w:t>
-      </w:r>
-      <w:r>
-        <w:rPr>
-          <w:noProof/>
-          <w:sz w:val="24"/>
-          <w:szCs w:val="24"/>
-        </w:rPr>
-        <w:fldChar w:fldCharType="end"/>
-      </w:r>
-      <w:r>
-        <w:rPr>
-          <w:sz w:val="24"/>
-        </w:rPr>
-        <w:t>, mes respectueuses salutations.</w:t>
+        <w:t>Je vous prie d'agréer</w:t>
+      </w:r>
+      <w:r>
+        <w:rPr>
+          <w:sz w:val="24"/>
+        </w:rPr>
+        <w:t xml:space="preserve">, </w:t>
+      </w:r>
+      <w:r>
+        <w:rPr>
+          <w:sz w:val="24"/>
+        </w:rPr>
+        <w:t>Madame, Monsieur</w:t>
+      </w:r>
+      <w:r>
+        <w:rPr>
+          <w:sz w:val="24"/>
+        </w:rPr>
+        <w:t>, l'expression de mes salutations distinguées.</w:t>
       </w:r>
     </w:p>
     <w:p>
@@ -1099,87 +712,96 @@
         <w:tabs>
           <w:tab w:val="left" w:pos="1764"/>
         </w:tabs>
-        <w:ind w:left="6379" w:firstLine="0"/>
+        <w:ind w:firstLine="0"/>
       </w:pPr>
     </w:p>
     <w:p>
       <w:pPr>
-        <w:pStyle w:val="Normalcentr"/>
-        <w:tabs>
-          <w:tab w:val="left" w:pos="1764"/>
-        </w:tabs>
-        <w:ind w:left="6379" w:firstLine="0"/>
+        <w:spacing w:after="200" w:line="276" w:lineRule="auto"/>
+        <w:jc w:val="both"/>
+        <w:rPr>
+          <w:sz w:val="24"/>
+          <w:szCs w:val="24"/>
+        </w:rPr>
       </w:pPr>
-      <w:r>
-        <w:t>Corinne VAN KLAVEREN</w:t>
-      </w:r>
     </w:p>
     <w:p>
       <w:pPr>
-        <w:pStyle w:val="Normalcentr"/>
-        <w:tabs>
-          <w:tab w:val="left" w:pos="1764"/>
-        </w:tabs>
-        <w:ind w:left="6379" w:firstLine="0"/>
+        <w:spacing w:after="200" w:line="276" w:lineRule="auto"/>
+        <w:ind w:left="4962" w:firstLine="1417"/>
+        <w:jc w:val="both"/>
+        <w:rPr>
+          <w:sz w:val="24"/>
+          <w:szCs w:val="24"/>
+        </w:rPr>
       </w:pPr>
       <w:r>
-        <w:t>Inspecteur Principal du Travail</w:t>
+        <w:rPr>
+          <w:sz w:val="24"/>
+          <w:szCs w:val="24"/>
+        </w:rPr>
+        <w:t>Véronique DENIS</w:t>
       </w:r>
     </w:p>
     <w:p>
       <w:pPr>
-        <w:pStyle w:val="Normalcentr"/>
-        <w:tabs>
-          <w:tab w:val="left" w:pos="1764"/>
-        </w:tabs>
-        <w:ind w:left="6379" w:firstLine="0"/>
+        <w:spacing w:after="200" w:line="276" w:lineRule="auto"/>
+        <w:ind w:left="4962" w:firstLine="1417"/>
+        <w:jc w:val="both"/>
+        <w:rPr>
+          <w:sz w:val="24"/>
+          <w:szCs w:val="24"/>
+        </w:rPr>
       </w:pPr>
       <w:r>
         <w:rPr>
+          <w:sz w:val="24"/>
+          <w:szCs w:val="24"/>
+        </w:rPr>
+        <w:t>Rédacteur Principal</w:t>
+      </w:r>
+    </w:p>
+    <w:p>
+      <w:pPr>
+        <w:spacing w:after="200" w:line="276" w:lineRule="auto"/>
+        <w:ind w:left="4962" w:firstLine="1417"/>
+        <w:jc w:val="both"/>
+        <w:rPr>
+          <w:sz w:val="24"/>
+          <w:szCs w:val="24"/>
+        </w:rPr>
+      </w:pPr>
+      <w:r>
+        <w:rPr>
           <w:noProof/>
         </w:rPr>
         <w:drawing>
-          <wp:inline distT="0" distB="0" distL="0" distR="0" wp14:anchorId="50126645" wp14:editId="6CEA3EAE">
-            <wp:extent cx="1483995" cy="864870"/>
-            <wp:effectExtent l="0" t="0" r="1905" b="0"/>
-            <wp:docPr id="3" name="Image 3" descr="\\Di-fil01\312-dan$\Projets\eAdmin - OneTeam\2.TELESERVICE\2. DIRECTION DU TRAVAIL\3. INSPECTION DU TRAVAIL\0. 2019 INSPECTION DU TRAVAIL\2.1. TS DERJFER\2. CONCEPTION\Courriers\CVK_Signature.png"/>
-            <wp:cNvGraphicFramePr>
-              <a:graphicFrameLocks xmlns:a="http://schemas.openxmlformats.org/drawingml/2006/main" noChangeAspect="1"/>
-            </wp:cNvGraphicFramePr>
+          <wp:inline distT="0" distB="0" distL="0" distR="0" wp14:anchorId="4F9288D4" wp14:editId="3B17E80D">
+            <wp:extent cx="1466850" cy="836930"/>
+            <wp:effectExtent l="0" t="0" r="0" b="1270"/>
+            <wp:docPr id="2" name="Image 2"/>
+            <wp:cNvGraphicFramePr/>
             <a:graphic xmlns:a="http://schemas.openxmlformats.org/drawingml/2006/main">
               <a:graphicData uri="http://schemas.openxmlformats.org/drawingml/2006/picture">
                 <pic:pic xmlns:pic="http://schemas.openxmlformats.org/drawingml/2006/picture">
                   <pic:nvPicPr>
-                    <pic:cNvPr id="0" name="Picture 1" descr="\\Di-fil01\312-dan$\Projets\eAdmin - OneTeam\2.TELESERVICE\2. DIRECTION DU TRAVAIL\3. INSPECTION DU TRAVAIL\0. 2019 INSPECTION DU TRAVAIL\2.1. TS DERJFER\2. CONCEPTION\Courriers\CVK_Signature.png"/>
-                    <pic:cNvPicPr>
-                      <a:picLocks noChangeAspect="1" noChangeArrowheads="1"/>
-                    </pic:cNvPicPr>
+                    <pic:cNvPr id="2" name="Image 2"/>
+                    <pic:cNvPicPr/>
                   </pic:nvPicPr>
                   <pic:blipFill>
-                    <a:blip r:embed="rId7">
-                      <a:extLst>
-                        <a:ext uri="{28A0092B-C50C-407E-A947-70E740481C1C}">
-                          <a14:useLocalDpi xmlns:a14="http://schemas.microsoft.com/office/drawing/2010/main" val="0"/>
-                        </a:ext>
-                      </a:extLst>
-                    </a:blip>
-                    <a:srcRect/>
+                    <a:blip r:embed="rId7"/>
                     <a:stretch>
                       <a:fillRect/>
                     </a:stretch>
                   </pic:blipFill>
-                  <pic:spPr bwMode="auto">
+                  <pic:spPr>
                     <a:xfrm>
                       <a:off x="0" y="0"/>
-                      <a:ext cx="1483995" cy="864870"/>
+                      <a:ext cx="1466850" cy="836930"/>
                     </a:xfrm>
                     <a:prstGeom prst="rect">
                       <a:avLst/>
                     </a:prstGeom>
-                    <a:noFill/>
-                    <a:ln>
-                      <a:noFill/>
-                    </a:ln>
                   </pic:spPr>
                 </pic:pic>
               </a:graphicData>
@@ -1188,14 +810,53 @@
         </w:drawing>
       </w:r>
     </w:p>
+    <w:p>
+      <w:pPr>
+        <w:spacing w:after="200" w:line="276" w:lineRule="auto"/>
+        <w:ind w:left="1418" w:right="1134"/>
+        <w:rPr>
+          <w:sz w:val="24"/>
+          <w:szCs w:val="24"/>
+        </w:rPr>
+      </w:pPr>
+      <w:r>
+        <w:t xml:space="preserve">Il est à noter qu’un nouveau </w:t>
+      </w:r>
+      <w:proofErr w:type="spellStart"/>
+      <w:r>
+        <w:t>téléservice</w:t>
+      </w:r>
+      <w:proofErr w:type="spellEnd"/>
+      <w:r>
+        <w:t xml:space="preserve"> est désormais disponible, dédié à la déclaration des détachements de salariés à Monaco pour une durée inférieure à 3 mois. </w:t>
+      </w:r>
+      <w:r>
+        <w:br/>
+        <w:t xml:space="preserve">Pour ce faire, je vous invite à vous rendre sur le site </w:t>
+      </w:r>
+      <w:hyperlink r:id="rId8" w:history="1">
+        <w:r>
+          <w:rPr>
+            <w:rStyle w:val="Lienhypertexte"/>
+          </w:rPr>
+          <w:t>http://service-public-entreprise.gouv.mc/</w:t>
+        </w:r>
+      </w:hyperlink>
+      <w:r>
+        <w:t> dans la rubrique “Emploi et social”.</w:t>
+      </w:r>
+    </w:p>
     <w:sectPr>
-      <w:headerReference w:type="first" r:id="rId8"/>
-      <w:footerReference w:type="first" r:id="rId9"/>
+      <w:headerReference w:type="even" r:id="rId9"/>
+      <w:headerReference w:type="default" r:id="rId10"/>
+      <w:footerReference w:type="even" r:id="rId11"/>
+      <w:footerReference w:type="default" r:id="rId12"/>
+      <w:headerReference w:type="first" r:id="rId13"/>
+      <w:footerReference w:type="first" r:id="rId14"/>
       <w:pgSz w:w="11907" w:h="16840"/>
-      <w:pgMar w:top="0" w:right="0" w:bottom="1418" w:left="0" w:header="0" w:footer="454" w:gutter="0"/>
+      <w:pgMar w:top="0" w:right="0" w:bottom="1701" w:left="0" w:header="0" w:footer="454" w:gutter="0"/>
       <w:cols w:space="720"/>
       <w:noEndnote/>
-      <w:titlePg/>
       <w:docGrid w:linePitch="272"/>
     </w:sectPr>
   </w:body>
@@ -1227,39 +888,163 @@
     <w:pPr>
       <w:pStyle w:val="Pieddepage"/>
     </w:pPr>
+  </w:p>
+</w:ftr>
+</file>
+
+<file path=word/footer2.xml><?xml version="1.0" encoding="utf-8"?>
+<w:ftr xmlns:wpc="http://schemas.microsoft.com/office/word/2010/wordprocessingCanvas" xmlns:cx="http://schemas.microsoft.com/office/drawing/2014/chartex" xmlns:cx1="http://schemas.microsoft.com/office/drawing/2015/9/8/chartex" xmlns:mc="http://schemas.openxmlformats.org/markup-compatibility/2006" xmlns:o="urn:schemas-microsoft-com:office:office" xmlns:r="http://schemas.openxmlformats.org/officeDocument/2006/relationships" xmlns:m="http://schemas.openxmlformats.org/officeDocument/2006/math" xmlns:v="urn:schemas-microsoft-com:vml" xmlns:wp14="http://schemas.microsoft.com/office/word/2010/wordprocessingDrawing" xmlns:wp="http://schemas.openxmlformats.org/drawingml/2006/wordprocessingDrawing" xmlns:w10="urn:schemas-microsoft-com:office:word" xmlns:w="http://schemas.openxmlformats.org/wordprocessingml/2006/main" xmlns:w14="http://schemas.microsoft.com/office/word/2010/wordml" xmlns:w15="http://schemas.microsoft.com/office/word/2012/wordml" xmlns:w16se="http://schemas.microsoft.com/office/word/2015/wordml/symex" xmlns:wpg="http://schemas.microsoft.com/office/word/2010/wordprocessingGroup" xmlns:wpi="http://schemas.microsoft.com/office/word/2010/wordprocessingInk" xmlns:wne="http://schemas.microsoft.com/office/word/2006/wordml" xmlns:wps="http://schemas.microsoft.com/office/word/2010/wordprocessingShape" mc:Ignorable="w14 w15 w16se wp14">
+  <w:p>
+    <w:pPr>
+      <w:widowControl w:val="0"/>
+      <w:autoSpaceDE w:val="0"/>
+      <w:autoSpaceDN w:val="0"/>
+      <w:adjustRightInd w:val="0"/>
+      <w:jc w:val="center"/>
+      <w:rPr>
+        <w:sz w:val="24"/>
+        <w:szCs w:val="24"/>
+      </w:rPr>
+    </w:pPr>
+    <w:r>
+      <w:rPr>
+        <w:bCs/>
+        <w:sz w:val="24"/>
+        <w:szCs w:val="24"/>
+      </w:rPr>
+      <w:fldChar w:fldCharType="begin"/>
+    </w:r>
+    <w:r>
+      <w:rPr>
+        <w:bCs/>
+        <w:sz w:val="24"/>
+        <w:szCs w:val="24"/>
+      </w:rPr>
+      <w:instrText>PAGE  \* Arabic  \* MERGEFORMAT</w:instrText>
+    </w:r>
+    <w:r>
+      <w:rPr>
+        <w:bCs/>
+        <w:sz w:val="24"/>
+        <w:szCs w:val="24"/>
+      </w:rPr>
+      <w:fldChar w:fldCharType="separate"/>
+    </w:r>
+    <w:r>
+      <w:rPr>
+        <w:bCs/>
+        <w:noProof/>
+        <w:sz w:val="24"/>
+        <w:szCs w:val="24"/>
+      </w:rPr>
+      <w:t>1</w:t>
+    </w:r>
+    <w:r>
+      <w:rPr>
+        <w:bCs/>
+        <w:sz w:val="24"/>
+        <w:szCs w:val="24"/>
+      </w:rPr>
+      <w:fldChar w:fldCharType="end"/>
+    </w:r>
+    <w:r>
+      <w:rPr>
+        <w:sz w:val="24"/>
+        <w:szCs w:val="24"/>
+      </w:rPr>
+      <w:t xml:space="preserve"> / </w:t>
+    </w:r>
+    <w:r>
+      <w:rPr>
+        <w:bCs/>
+        <w:sz w:val="24"/>
+        <w:szCs w:val="24"/>
+      </w:rPr>
+      <w:fldChar w:fldCharType="begin"/>
+    </w:r>
+    <w:r>
+      <w:rPr>
+        <w:bCs/>
+        <w:sz w:val="24"/>
+        <w:szCs w:val="24"/>
+      </w:rPr>
+      <w:instrText>NUMPAGES  \* Arabic  \* MERGEFORMAT</w:instrText>
+    </w:r>
+    <w:r>
+      <w:rPr>
+        <w:bCs/>
+        <w:sz w:val="24"/>
+        <w:szCs w:val="24"/>
+      </w:rPr>
+      <w:fldChar w:fldCharType="separate"/>
+    </w:r>
+    <w:r>
+      <w:rPr>
+        <w:bCs/>
+        <w:noProof/>
+        <w:sz w:val="24"/>
+        <w:szCs w:val="24"/>
+      </w:rPr>
+      <w:t>1</w:t>
+    </w:r>
+    <w:r>
+      <w:rPr>
+        <w:bCs/>
+        <w:sz w:val="24"/>
+        <w:szCs w:val="24"/>
+      </w:rPr>
+      <w:fldChar w:fldCharType="end"/>
+    </w:r>
+    <w:r>
+      <w:rPr>
+        <w:bCs/>
+        <w:sz w:val="24"/>
+        <w:szCs w:val="24"/>
+      </w:rPr>
+      <w:t xml:space="preserve"> </w:t>
+    </w:r>
     <w:r>
       <w:rPr>
         <w:noProof/>
       </w:rPr>
       <w:drawing>
-        <wp:inline distT="0" distB="0" distL="0" distR="0" wp14:anchorId="7237D438" wp14:editId="62D557C3">
-          <wp:extent cx="7211431" cy="657317"/>
-          <wp:effectExtent l="0" t="0" r="0" b="9525"/>
-          <wp:docPr id="1" name="Image 1"/>
-          <wp:cNvGraphicFramePr>
-            <a:graphicFrameLocks xmlns:a="http://schemas.openxmlformats.org/drawingml/2006/main" noChangeAspect="1"/>
-          </wp:cNvGraphicFramePr>
+        <wp:inline distT="0" distB="0" distL="0" distR="0" wp14:anchorId="2894AC23" wp14:editId="0EFCB6D0">
+          <wp:extent cx="7556500" cy="358140"/>
+          <wp:effectExtent l="0" t="0" r="6350" b="3810"/>
+          <wp:docPr id="10" name="Image 10" descr="C:\Users\mpavone.ext\Desktop\departementaffaire.jpg"/>
+          <wp:cNvGraphicFramePr/>
           <a:graphic xmlns:a="http://schemas.openxmlformats.org/drawingml/2006/main">
             <a:graphicData uri="http://schemas.openxmlformats.org/drawingml/2006/picture">
               <pic:pic xmlns:pic="http://schemas.openxmlformats.org/drawingml/2006/picture">
                 <pic:nvPicPr>
-                  <pic:cNvPr id="1" name=""/>
+                  <pic:cNvPr id="10" name="Image 10" descr="C:\Users\mpavone.ext\Desktop\departementaffaire.jpg"/>
                   <pic:cNvPicPr/>
                 </pic:nvPicPr>
                 <pic:blipFill>
-                  <a:blip r:embed="rId1"/>
+                  <a:blip r:embed="rId1">
+                    <a:extLst>
+                      <a:ext uri="{28A0092B-C50C-407E-A947-70E740481C1C}">
+                        <a14:useLocalDpi xmlns:a14="http://schemas.microsoft.com/office/drawing/2010/main" val="0"/>
+                      </a:ext>
+                    </a:extLst>
+                  </a:blip>
+                  <a:srcRect/>
                   <a:stretch>
                     <a:fillRect/>
                   </a:stretch>
                 </pic:blipFill>
-                <pic:spPr>
+                <pic:spPr bwMode="auto">
                   <a:xfrm>
                     <a:off x="0" y="0"/>
-                    <a:ext cx="7211431" cy="657317"/>
+                    <a:ext cx="7556500" cy="358140"/>
                   </a:xfrm>
                   <a:prstGeom prst="rect">
                     <a:avLst/>
                   </a:prstGeom>
+                  <a:noFill/>
+                  <a:ln>
+                    <a:noFill/>
+                  </a:ln>
                 </pic:spPr>
               </pic:pic>
             </a:graphicData>
@@ -1271,27 +1056,57 @@
 </w:ftr>
 </file>
 
-<file path=word/footnotes.xml><?xml version="1.0" encoding="utf-8"?>
-<w:footnotes xmlns:wpc="http://schemas.microsoft.com/office/word/2010/wordprocessingCanvas" xmlns:cx="http://schemas.microsoft.com/office/drawing/2014/chartex" xmlns:cx1="http://schemas.microsoft.com/office/drawing/2015/9/8/chartex" xmlns:mc="http://schemas.openxmlformats.org/markup-compatibility/2006" xmlns:o="urn:schemas-microsoft-com:office:office" xmlns:r="http://schemas.openxmlformats.org/officeDocument/2006/relationships" xmlns:m="http://schemas.openxmlformats.org/officeDocument/2006/math" xmlns:v="urn:schemas-microsoft-com:vml" xmlns:wp14="http://schemas.microsoft.com/office/word/2010/wordprocessingDrawing" xmlns:wp="http://schemas.openxmlformats.org/drawingml/2006/wordprocessingDrawing" xmlns:w10="urn:schemas-microsoft-com:office:word" xmlns:w="http://schemas.openxmlformats.org/wordprocessingml/2006/main" xmlns:w14="http://schemas.microsoft.com/office/word/2010/wordml" xmlns:w15="http://schemas.microsoft.com/office/word/2012/wordml" xmlns:w16se="http://schemas.microsoft.com/office/word/2015/wordml/symex" xmlns:wpg="http://schemas.microsoft.com/office/word/2010/wordprocessingGroup" xmlns:wpi="http://schemas.microsoft.com/office/word/2010/wordprocessingInk" xmlns:wne="http://schemas.microsoft.com/office/word/2006/wordml" xmlns:wps="http://schemas.microsoft.com/office/word/2010/wordprocessingShape" mc:Ignorable="w14 w15 w16se wp14">
-  <w:footnote w:type="separator" w:id="-1">
-    <w:p>
-      <w:r>
-        <w:separator/>
-      </w:r>
-    </w:p>
-  </w:footnote>
-  <w:footnote w:type="continuationSeparator" w:id="0">
-    <w:p>
-      <w:r>
-        <w:continuationSeparator/>
-      </w:r>
-    </w:p>
-  </w:footnote>
-</w:footnotes>
-</file>
-
-<file path=word/header1.xml><?xml version="1.0" encoding="utf-8"?>
-<w:hdr xmlns:wpc="http://schemas.microsoft.com/office/word/2010/wordprocessingCanvas" xmlns:cx="http://schemas.microsoft.com/office/drawing/2014/chartex" xmlns:cx1="http://schemas.microsoft.com/office/drawing/2015/9/8/chartex" xmlns:mc="http://schemas.openxmlformats.org/markup-compatibility/2006" xmlns:o="urn:schemas-microsoft-com:office:office" xmlns:r="http://schemas.openxmlformats.org/officeDocument/2006/relationships" xmlns:m="http://schemas.openxmlformats.org/officeDocument/2006/math" xmlns:v="urn:schemas-microsoft-com:vml" xmlns:wp14="http://schemas.microsoft.com/office/word/2010/wordprocessingDrawing" xmlns:wp="http://schemas.openxmlformats.org/drawingml/2006/wordprocessingDrawing" xmlns:w10="urn:schemas-microsoft-com:office:word" xmlns:w="http://schemas.openxmlformats.org/wordprocessingml/2006/main" xmlns:w14="http://schemas.microsoft.com/office/word/2010/wordml" xmlns:w15="http://schemas.microsoft.com/office/word/2012/wordml" xmlns:w16se="http://schemas.microsoft.com/office/word/2015/wordml/symex" xmlns:wpg="http://schemas.microsoft.com/office/word/2010/wordprocessingGroup" xmlns:wpi="http://schemas.microsoft.com/office/word/2010/wordprocessingInk" xmlns:wne="http://schemas.microsoft.com/office/word/2006/wordml" xmlns:wps="http://schemas.microsoft.com/office/word/2010/wordprocessingShape" mc:Ignorable="w14 w15 w16se wp14">
+<file path=word/footer3.xml><?xml version="1.0" encoding="utf-8"?>
+<w:ftr xmlns:wpc="http://schemas.microsoft.com/office/word/2010/wordprocessingCanvas" xmlns:cx="http://schemas.microsoft.com/office/drawing/2014/chartex" xmlns:cx1="http://schemas.microsoft.com/office/drawing/2015/9/8/chartex" xmlns:mc="http://schemas.openxmlformats.org/markup-compatibility/2006" xmlns:o="urn:schemas-microsoft-com:office:office" xmlns:r="http://schemas.openxmlformats.org/officeDocument/2006/relationships" xmlns:m="http://schemas.openxmlformats.org/officeDocument/2006/math" xmlns:v="urn:schemas-microsoft-com:vml" xmlns:wp14="http://schemas.microsoft.com/office/word/2010/wordprocessingDrawing" xmlns:wp="http://schemas.openxmlformats.org/drawingml/2006/wordprocessingDrawing" xmlns:w10="urn:schemas-microsoft-com:office:word" xmlns:w="http://schemas.openxmlformats.org/wordprocessingml/2006/main" xmlns:w14="http://schemas.microsoft.com/office/word/2010/wordml" xmlns:w15="http://schemas.microsoft.com/office/word/2012/wordml" xmlns:w16se="http://schemas.microsoft.com/office/word/2015/wordml/symex" xmlns:wpg="http://schemas.microsoft.com/office/word/2010/wordprocessingGroup" xmlns:wpi="http://schemas.microsoft.com/office/word/2010/wordprocessingInk" xmlns:wne="http://schemas.microsoft.com/office/word/2006/wordml" xmlns:wps="http://schemas.microsoft.com/office/word/2010/wordprocessingShape" mc:Ignorable="w14 w15 w16se wp14">
+  <w:sdt>
+    <w:sdtPr>
+      <w:id w:val="2109068102"/>
+      <w:docPartObj>
+        <w:docPartGallery w:val="Page Numbers (Top of Page)"/>
+        <w:docPartUnique/>
+      </w:docPartObj>
+    </w:sdtPr>
+    <w:sdtEndPr/>
+    <w:sdtContent>
+      <w:p>
+        <w:pPr>
+          <w:pStyle w:val="En-tte"/>
+          <w:jc w:val="center"/>
+        </w:pPr>
+        <w:r>
+          <w:rPr>
+            <w:sz w:val="24"/>
+          </w:rPr>
+          <w:fldChar w:fldCharType="begin"/>
+        </w:r>
+        <w:r>
+          <w:rPr>
+            <w:sz w:val="24"/>
+          </w:rPr>
+          <w:instrText>PAGE   \* MERGEFORMAT</w:instrText>
+        </w:r>
+        <w:r>
+          <w:rPr>
+            <w:sz w:val="24"/>
+          </w:rPr>
+          <w:fldChar w:fldCharType="separate"/>
+        </w:r>
+        <w:r>
+          <w:rPr>
+            <w:noProof/>
+            <w:sz w:val="24"/>
+          </w:rPr>
+          <w:t>1</w:t>
+        </w:r>
+        <w:r>
+          <w:rPr>
+            <w:sz w:val="24"/>
+          </w:rPr>
+          <w:fldChar w:fldCharType="end"/>
+        </w:r>
+      </w:p>
+    </w:sdtContent>
+  </w:sdt>
   <w:p>
     <w:pPr>
       <w:widowControl w:val="0"/>
@@ -1309,11 +1124,27 @@
         <w:sz w:val="24"/>
         <w:szCs w:val="24"/>
       </w:rPr>
+      <w:t xml:space="preserve"> </w:t>
+    </w:r>
+    <w:r>
+      <w:rPr>
+        <w:noProof/>
+        <w:sz w:val="24"/>
+        <w:szCs w:val="24"/>
+      </w:rPr>
       <w:drawing>
-        <wp:inline distT="0" distB="0" distL="0" distR="0" wp14:anchorId="48A352C9" wp14:editId="35D8ED49">
-          <wp:extent cx="7560945" cy="808311"/>
-          <wp:effectExtent l="0" t="0" r="1905" b="0"/>
-          <wp:docPr id="2" name="Image 2"/>
+        <wp:anchor distT="0" distB="0" distL="114300" distR="114300" simplePos="0" relativeHeight="251659264" behindDoc="1" locked="0" layoutInCell="1" allowOverlap="1">
+          <wp:simplePos x="0" y="0"/>
+          <wp:positionH relativeFrom="column">
+            <wp:posOffset>0</wp:posOffset>
+          </wp:positionH>
+          <wp:positionV relativeFrom="paragraph">
+            <wp:posOffset>-545465</wp:posOffset>
+          </wp:positionV>
+          <wp:extent cx="7554595" cy="718820"/>
+          <wp:effectExtent l="0" t="0" r="8255" b="5080"/>
+          <wp:wrapNone/>
+          <wp:docPr id="1" name="Image 1"/>
           <wp:cNvGraphicFramePr>
             <a:graphicFrameLocks xmlns:a="http://schemas.openxmlformats.org/drawingml/2006/main" noChangeAspect="1"/>
           </wp:cNvGraphicFramePr>
@@ -1327,7 +1158,7 @@
                   </pic:cNvPicPr>
                 </pic:nvPicPr>
                 <pic:blipFill>
-                  <a:blip r:embed="rId1">
+                  <a:blip r:embed="rId1" cstate="print">
                     <a:extLst>
                       <a:ext uri="{28A0092B-C50C-407E-A947-70E740481C1C}">
                         <a14:useLocalDpi xmlns:a14="http://schemas.microsoft.com/office/drawing/2010/main" val="0"/>
@@ -1342,7 +1173,101 @@
                 <pic:spPr bwMode="auto">
                   <a:xfrm>
                     <a:off x="0" y="0"/>
-                    <a:ext cx="7560945" cy="808311"/>
+                    <a:ext cx="7554595" cy="718820"/>
+                  </a:xfrm>
+                  <a:prstGeom prst="rect">
+                    <a:avLst/>
+                  </a:prstGeom>
+                  <a:noFill/>
+                  <a:ln>
+                    <a:noFill/>
+                  </a:ln>
+                </pic:spPr>
+              </pic:pic>
+            </a:graphicData>
+          </a:graphic>
+        </wp:anchor>
+      </w:drawing>
+    </w:r>
+  </w:p>
+</w:ftr>
+</file>
+
+<file path=word/footnotes.xml><?xml version="1.0" encoding="utf-8"?>
+<w:footnotes xmlns:wpc="http://schemas.microsoft.com/office/word/2010/wordprocessingCanvas" xmlns:cx="http://schemas.microsoft.com/office/drawing/2014/chartex" xmlns:cx1="http://schemas.microsoft.com/office/drawing/2015/9/8/chartex" xmlns:mc="http://schemas.openxmlformats.org/markup-compatibility/2006" xmlns:o="urn:schemas-microsoft-com:office:office" xmlns:r="http://schemas.openxmlformats.org/officeDocument/2006/relationships" xmlns:m="http://schemas.openxmlformats.org/officeDocument/2006/math" xmlns:v="urn:schemas-microsoft-com:vml" xmlns:wp14="http://schemas.microsoft.com/office/word/2010/wordprocessingDrawing" xmlns:wp="http://schemas.openxmlformats.org/drawingml/2006/wordprocessingDrawing" xmlns:w10="urn:schemas-microsoft-com:office:word" xmlns:w="http://schemas.openxmlformats.org/wordprocessingml/2006/main" xmlns:w14="http://schemas.microsoft.com/office/word/2010/wordml" xmlns:w15="http://schemas.microsoft.com/office/word/2012/wordml" xmlns:w16se="http://schemas.microsoft.com/office/word/2015/wordml/symex" xmlns:wpg="http://schemas.microsoft.com/office/word/2010/wordprocessingGroup" xmlns:wpi="http://schemas.microsoft.com/office/word/2010/wordprocessingInk" xmlns:wne="http://schemas.microsoft.com/office/word/2006/wordml" xmlns:wps="http://schemas.microsoft.com/office/word/2010/wordprocessingShape" mc:Ignorable="w14 w15 w16se wp14">
+  <w:footnote w:type="separator" w:id="-1">
+    <w:p>
+      <w:r>
+        <w:separator/>
+      </w:r>
+    </w:p>
+  </w:footnote>
+  <w:footnote w:type="continuationSeparator" w:id="0">
+    <w:p>
+      <w:r>
+        <w:continuationSeparator/>
+      </w:r>
+    </w:p>
+  </w:footnote>
+</w:footnotes>
+</file>
+
+<file path=word/header1.xml><?xml version="1.0" encoding="utf-8"?>
+<w:hdr xmlns:wpc="http://schemas.microsoft.com/office/word/2010/wordprocessingCanvas" xmlns:cx="http://schemas.microsoft.com/office/drawing/2014/chartex" xmlns:cx1="http://schemas.microsoft.com/office/drawing/2015/9/8/chartex" xmlns:mc="http://schemas.openxmlformats.org/markup-compatibility/2006" xmlns:o="urn:schemas-microsoft-com:office:office" xmlns:r="http://schemas.openxmlformats.org/officeDocument/2006/relationships" xmlns:m="http://schemas.openxmlformats.org/officeDocument/2006/math" xmlns:v="urn:schemas-microsoft-com:vml" xmlns:wp14="http://schemas.microsoft.com/office/word/2010/wordprocessingDrawing" xmlns:wp="http://schemas.openxmlformats.org/drawingml/2006/wordprocessingDrawing" xmlns:w10="urn:schemas-microsoft-com:office:word" xmlns:w="http://schemas.openxmlformats.org/wordprocessingml/2006/main" xmlns:w14="http://schemas.microsoft.com/office/word/2010/wordml" xmlns:w15="http://schemas.microsoft.com/office/word/2012/wordml" xmlns:w16se="http://schemas.microsoft.com/office/word/2015/wordml/symex" xmlns:wpg="http://schemas.microsoft.com/office/word/2010/wordprocessingGroup" xmlns:wpi="http://schemas.microsoft.com/office/word/2010/wordprocessingInk" xmlns:wne="http://schemas.microsoft.com/office/word/2006/wordml" xmlns:wps="http://schemas.microsoft.com/office/word/2010/wordprocessingShape" mc:Ignorable="w14 w15 w16se wp14">
+  <w:p>
+    <w:pPr>
+      <w:pStyle w:val="En-tte"/>
+    </w:pPr>
+  </w:p>
+</w:hdr>
+</file>
+
+<file path=word/header2.xml><?xml version="1.0" encoding="utf-8"?>
+<w:hdr xmlns:wpc="http://schemas.microsoft.com/office/word/2010/wordprocessingCanvas" xmlns:cx="http://schemas.microsoft.com/office/drawing/2014/chartex" xmlns:cx1="http://schemas.microsoft.com/office/drawing/2015/9/8/chartex" xmlns:mc="http://schemas.openxmlformats.org/markup-compatibility/2006" xmlns:o="urn:schemas-microsoft-com:office:office" xmlns:r="http://schemas.openxmlformats.org/officeDocument/2006/relationships" xmlns:m="http://schemas.openxmlformats.org/officeDocument/2006/math" xmlns:v="urn:schemas-microsoft-com:vml" xmlns:wp14="http://schemas.microsoft.com/office/word/2010/wordprocessingDrawing" xmlns:wp="http://schemas.openxmlformats.org/drawingml/2006/wordprocessingDrawing" xmlns:w10="urn:schemas-microsoft-com:office:word" xmlns:w="http://schemas.openxmlformats.org/wordprocessingml/2006/main" xmlns:w14="http://schemas.microsoft.com/office/word/2010/wordml" xmlns:w15="http://schemas.microsoft.com/office/word/2012/wordml" xmlns:w16se="http://schemas.microsoft.com/office/word/2015/wordml/symex" xmlns:wpg="http://schemas.microsoft.com/office/word/2010/wordprocessingGroup" xmlns:wpi="http://schemas.microsoft.com/office/word/2010/wordprocessingInk" xmlns:wne="http://schemas.microsoft.com/office/word/2006/wordml" xmlns:wps="http://schemas.microsoft.com/office/word/2010/wordprocessingShape" mc:Ignorable="w14 w15 w16se wp14">
+  <w:p>
+    <w:pPr>
+      <w:pStyle w:val="En-tte"/>
+    </w:pPr>
+    <w:r>
+      <w:rPr>
+        <w:noProof/>
+        <w:sz w:val="24"/>
+        <w:szCs w:val="24"/>
+      </w:rPr>
+      <w:drawing>
+        <wp:inline distT="0" distB="0" distL="0" distR="0" wp14:anchorId="23E65EE8" wp14:editId="57D3A5EC">
+          <wp:extent cx="7560945" cy="1371255"/>
+          <wp:effectExtent l="0" t="0" r="1905" b="635"/>
+          <wp:docPr id="3" name="Image 3"/>
+          <wp:cNvGraphicFramePr>
+            <a:graphicFrameLocks xmlns:a="http://schemas.openxmlformats.org/drawingml/2006/main" noChangeAspect="1"/>
+          </wp:cNvGraphicFramePr>
+          <a:graphic xmlns:a="http://schemas.openxmlformats.org/drawingml/2006/main">
+            <a:graphicData uri="http://schemas.openxmlformats.org/drawingml/2006/picture">
+              <pic:pic xmlns:pic="http://schemas.openxmlformats.org/drawingml/2006/picture">
+                <pic:nvPicPr>
+                  <pic:cNvPr id="0" name="Image 2"/>
+                  <pic:cNvPicPr>
+                    <a:picLocks noChangeAspect="1" noChangeArrowheads="1"/>
+                  </pic:cNvPicPr>
+                </pic:nvPicPr>
+                <pic:blipFill>
+                  <a:blip r:embed="rId1" cstate="print">
+                    <a:extLst>
+                      <a:ext uri="{28A0092B-C50C-407E-A947-70E740481C1C}">
+                        <a14:useLocalDpi xmlns:a14="http://schemas.microsoft.com/office/drawing/2010/main" val="0"/>
+                      </a:ext>
+                    </a:extLst>
+                  </a:blip>
+                  <a:srcRect/>
+                  <a:stretch>
+                    <a:fillRect/>
+                  </a:stretch>
+                </pic:blipFill>
+                <pic:spPr bwMode="auto">
+                  <a:xfrm>
+                    <a:off x="0" y="0"/>
+                    <a:ext cx="7560945" cy="1371255"/>
                   </a:xfrm>
                   <a:prstGeom prst="rect">
                     <a:avLst/>
@@ -1362,357 +1287,74 @@
 </w:hdr>
 </file>
 
-<file path=word/numbering.xml><?xml version="1.0" encoding="utf-8"?>
-<w:numbering xmlns:wpc="http://schemas.microsoft.com/office/word/2010/wordprocessingCanvas" xmlns:cx="http://schemas.microsoft.com/office/drawing/2014/chartex" xmlns:cx1="http://schemas.microsoft.com/office/drawing/2015/9/8/chartex" xmlns:mc="http://schemas.openxmlformats.org/markup-compatibility/2006" xmlns:o="urn:schemas-microsoft-com:office:office" xmlns:r="http://schemas.openxmlformats.org/officeDocument/2006/relationships" xmlns:m="http://schemas.openxmlformats.org/officeDocument/2006/math" xmlns:v="urn:schemas-microsoft-com:vml" xmlns:wp14="http://schemas.microsoft.com/office/word/2010/wordprocessingDrawing" xmlns:wp="http://schemas.openxmlformats.org/drawingml/2006/wordprocessingDrawing" xmlns:w10="urn:schemas-microsoft-com:office:word" xmlns:w="http://schemas.openxmlformats.org/wordprocessingml/2006/main" xmlns:w14="http://schemas.microsoft.com/office/word/2010/wordml" xmlns:w15="http://schemas.microsoft.com/office/word/2012/wordml" xmlns:w16se="http://schemas.microsoft.com/office/word/2015/wordml/symex" xmlns:wpg="http://schemas.microsoft.com/office/word/2010/wordprocessingGroup" xmlns:wpi="http://schemas.microsoft.com/office/word/2010/wordprocessingInk" xmlns:wne="http://schemas.microsoft.com/office/word/2006/wordml" xmlns:wps="http://schemas.microsoft.com/office/word/2010/wordprocessingShape" mc:Ignorable="w14 w15 w16se wp14">
-  <w:abstractNum w:abstractNumId="0" w15:restartNumberingAfterBreak="0">
-    <w:nsid w:val="143D14D0"/>
-    <w:multiLevelType w:val="hybridMultilevel"/>
-    <w:tmpl w:val="24E26F38"/>
-    <w:lvl w:ilvl="0" w:tplc="040C0001">
-      <w:start w:val="1"/>
-      <w:numFmt w:val="bullet"/>
-      <w:lvlText w:val=""/>
-      <w:lvlJc w:val="left"/>
-      <w:pPr>
-        <w:ind w:left="2858" w:hanging="360"/>
-      </w:pPr>
+<file path=word/header3.xml><?xml version="1.0" encoding="utf-8"?>
+<w:hdr xmlns:wpc="http://schemas.microsoft.com/office/word/2010/wordprocessingCanvas" xmlns:cx="http://schemas.microsoft.com/office/drawing/2014/chartex" xmlns:cx1="http://schemas.microsoft.com/office/drawing/2015/9/8/chartex" xmlns:mc="http://schemas.openxmlformats.org/markup-compatibility/2006" xmlns:o="urn:schemas-microsoft-com:office:office" xmlns:r="http://schemas.openxmlformats.org/officeDocument/2006/relationships" xmlns:m="http://schemas.openxmlformats.org/officeDocument/2006/math" xmlns:v="urn:schemas-microsoft-com:vml" xmlns:wp14="http://schemas.microsoft.com/office/word/2010/wordprocessingDrawing" xmlns:wp="http://schemas.openxmlformats.org/drawingml/2006/wordprocessingDrawing" xmlns:w10="urn:schemas-microsoft-com:office:word" xmlns:w="http://schemas.openxmlformats.org/wordprocessingml/2006/main" xmlns:w14="http://schemas.microsoft.com/office/word/2010/wordml" xmlns:w15="http://schemas.microsoft.com/office/word/2012/wordml" xmlns:w16se="http://schemas.microsoft.com/office/word/2015/wordml/symex" xmlns:wpg="http://schemas.microsoft.com/office/word/2010/wordprocessingGroup" xmlns:wpi="http://schemas.microsoft.com/office/word/2010/wordprocessingInk" xmlns:wne="http://schemas.microsoft.com/office/word/2006/wordml" xmlns:wps="http://schemas.microsoft.com/office/word/2010/wordprocessingShape" mc:Ignorable="w14 w15 w16se wp14">
+  <w:p>
+    <w:pPr>
+      <w:pStyle w:val="En-tte"/>
+      <w:tabs>
+        <w:tab w:val="clear" w:pos="9072"/>
+        <w:tab w:val="left" w:pos="5192"/>
+        <w:tab w:val="left" w:pos="6490"/>
+      </w:tabs>
+    </w:pPr>
+    <w:r>
       <w:rPr>
-        <w:rFonts w:ascii="Symbol" w:hAnsi="Symbol" w:hint="default"/>
+        <w:noProof/>
+        <w:sz w:val="24"/>
+        <w:szCs w:val="24"/>
       </w:rPr>
-    </w:lvl>
-    <w:lvl w:ilvl="1" w:tplc="040C0003" w:tentative="1">
-      <w:start w:val="1"/>
-      <w:numFmt w:val="bullet"/>
-      <w:lvlText w:val="o"/>
-      <w:lvlJc w:val="left"/>
-      <w:pPr>
-        <w:ind w:left="3578" w:hanging="360"/>
-      </w:pPr>
-      <w:rPr>
-        <w:rFonts w:ascii="Courier New" w:hAnsi="Courier New" w:cs="Courier New" w:hint="default"/>
-      </w:rPr>
-    </w:lvl>
-    <w:lvl w:ilvl="2" w:tplc="040C0005" w:tentative="1">
-      <w:start w:val="1"/>
-      <w:numFmt w:val="bullet"/>
-      <w:lvlText w:val=""/>
-      <w:lvlJc w:val="left"/>
-      <w:pPr>
-        <w:ind w:left="4298" w:hanging="360"/>
-      </w:pPr>
-      <w:rPr>
-        <w:rFonts w:ascii="Wingdings" w:hAnsi="Wingdings" w:hint="default"/>
-      </w:rPr>
-    </w:lvl>
-    <w:lvl w:ilvl="3" w:tplc="040C0001" w:tentative="1">
-      <w:start w:val="1"/>
-      <w:numFmt w:val="bullet"/>
-      <w:lvlText w:val=""/>
-      <w:lvlJc w:val="left"/>
-      <w:pPr>
-        <w:ind w:left="5018" w:hanging="360"/>
-      </w:pPr>
-      <w:rPr>
-        <w:rFonts w:ascii="Symbol" w:hAnsi="Symbol" w:hint="default"/>
-      </w:rPr>
-    </w:lvl>
-    <w:lvl w:ilvl="4" w:tplc="040C0003" w:tentative="1">
-      <w:start w:val="1"/>
-      <w:numFmt w:val="bullet"/>
-      <w:lvlText w:val="o"/>
-      <w:lvlJc w:val="left"/>
-      <w:pPr>
-        <w:ind w:left="5738" w:hanging="360"/>
-      </w:pPr>
-      <w:rPr>
-        <w:rFonts w:ascii="Courier New" w:hAnsi="Courier New" w:cs="Courier New" w:hint="default"/>
-      </w:rPr>
-    </w:lvl>
-    <w:lvl w:ilvl="5" w:tplc="040C0005" w:tentative="1">
-      <w:start w:val="1"/>
-      <w:numFmt w:val="bullet"/>
-      <w:lvlText w:val=""/>
-      <w:lvlJc w:val="left"/>
-      <w:pPr>
-        <w:ind w:left="6458" w:hanging="360"/>
-      </w:pPr>
-      <w:rPr>
-        <w:rFonts w:ascii="Wingdings" w:hAnsi="Wingdings" w:hint="default"/>
-      </w:rPr>
-    </w:lvl>
-    <w:lvl w:ilvl="6" w:tplc="040C0001" w:tentative="1">
-      <w:start w:val="1"/>
-      <w:numFmt w:val="bullet"/>
-      <w:lvlText w:val=""/>
-      <w:lvlJc w:val="left"/>
-      <w:pPr>
-        <w:ind w:left="7178" w:hanging="360"/>
-      </w:pPr>
-      <w:rPr>
-        <w:rFonts w:ascii="Symbol" w:hAnsi="Symbol" w:hint="default"/>
-      </w:rPr>
-    </w:lvl>
-    <w:lvl w:ilvl="7" w:tplc="040C0003" w:tentative="1">
-      <w:start w:val="1"/>
-      <w:numFmt w:val="bullet"/>
-      <w:lvlText w:val="o"/>
-      <w:lvlJc w:val="left"/>
-      <w:pPr>
-        <w:ind w:left="7898" w:hanging="360"/>
-      </w:pPr>
-      <w:rPr>
-        <w:rFonts w:ascii="Courier New" w:hAnsi="Courier New" w:cs="Courier New" w:hint="default"/>
-      </w:rPr>
-    </w:lvl>
-    <w:lvl w:ilvl="8" w:tplc="040C0005" w:tentative="1">
-      <w:start w:val="1"/>
-      <w:numFmt w:val="bullet"/>
-      <w:lvlText w:val=""/>
-      <w:lvlJc w:val="left"/>
-      <w:pPr>
-        <w:ind w:left="8618" w:hanging="360"/>
-      </w:pPr>
-      <w:rPr>
-        <w:rFonts w:ascii="Wingdings" w:hAnsi="Wingdings" w:hint="default"/>
-      </w:rPr>
-    </w:lvl>
-  </w:abstractNum>
-  <w:abstractNum w:abstractNumId="1" w15:restartNumberingAfterBreak="0">
-    <w:nsid w:val="59A30D87"/>
-    <w:multiLevelType w:val="hybridMultilevel"/>
-    <w:tmpl w:val="50DA3854"/>
-    <w:lvl w:ilvl="0" w:tplc="040C0001">
-      <w:start w:val="1"/>
-      <w:numFmt w:val="bullet"/>
-      <w:lvlText w:val=""/>
-      <w:lvlJc w:val="left"/>
-      <w:pPr>
-        <w:ind w:left="2138" w:hanging="360"/>
-      </w:pPr>
-      <w:rPr>
-        <w:rFonts w:ascii="Symbol" w:hAnsi="Symbol" w:hint="default"/>
-      </w:rPr>
-    </w:lvl>
-    <w:lvl w:ilvl="1" w:tplc="040C0003" w:tentative="1">
-      <w:start w:val="1"/>
-      <w:numFmt w:val="bullet"/>
-      <w:lvlText w:val="o"/>
-      <w:lvlJc w:val="left"/>
-      <w:pPr>
-        <w:ind w:left="2858" w:hanging="360"/>
-      </w:pPr>
-      <w:rPr>
-        <w:rFonts w:ascii="Courier New" w:hAnsi="Courier New" w:cs="Courier New" w:hint="default"/>
-      </w:rPr>
-    </w:lvl>
-    <w:lvl w:ilvl="2" w:tplc="040C0005" w:tentative="1">
-      <w:start w:val="1"/>
-      <w:numFmt w:val="bullet"/>
-      <w:lvlText w:val=""/>
-      <w:lvlJc w:val="left"/>
-      <w:pPr>
-        <w:ind w:left="3578" w:hanging="360"/>
-      </w:pPr>
-      <w:rPr>
-        <w:rFonts w:ascii="Wingdings" w:hAnsi="Wingdings" w:hint="default"/>
-      </w:rPr>
-    </w:lvl>
-    <w:lvl w:ilvl="3" w:tplc="040C0001" w:tentative="1">
-      <w:start w:val="1"/>
-      <w:numFmt w:val="bullet"/>
-      <w:lvlText w:val=""/>
-      <w:lvlJc w:val="left"/>
-      <w:pPr>
-        <w:ind w:left="4298" w:hanging="360"/>
-      </w:pPr>
-      <w:rPr>
-        <w:rFonts w:ascii="Symbol" w:hAnsi="Symbol" w:hint="default"/>
-      </w:rPr>
-    </w:lvl>
-    <w:lvl w:ilvl="4" w:tplc="040C0003" w:tentative="1">
-      <w:start w:val="1"/>
-      <w:numFmt w:val="bullet"/>
-      <w:lvlText w:val="o"/>
-      <w:lvlJc w:val="left"/>
-      <w:pPr>
-        <w:ind w:left="5018" w:hanging="360"/>
-      </w:pPr>
-      <w:rPr>
-        <w:rFonts w:ascii="Courier New" w:hAnsi="Courier New" w:cs="Courier New" w:hint="default"/>
-      </w:rPr>
-    </w:lvl>
-    <w:lvl w:ilvl="5" w:tplc="040C0005" w:tentative="1">
-      <w:start w:val="1"/>
-      <w:numFmt w:val="bullet"/>
-      <w:lvlText w:val=""/>
-      <w:lvlJc w:val="left"/>
-      <w:pPr>
-        <w:ind w:left="5738" w:hanging="360"/>
-      </w:pPr>
-      <w:rPr>
-        <w:rFonts w:ascii="Wingdings" w:hAnsi="Wingdings" w:hint="default"/>
-      </w:rPr>
-    </w:lvl>
-    <w:lvl w:ilvl="6" w:tplc="040C0001" w:tentative="1">
-      <w:start w:val="1"/>
-      <w:numFmt w:val="bullet"/>
-      <w:lvlText w:val=""/>
-      <w:lvlJc w:val="left"/>
-      <w:pPr>
-        <w:ind w:left="6458" w:hanging="360"/>
-      </w:pPr>
-      <w:rPr>
-        <w:rFonts w:ascii="Symbol" w:hAnsi="Symbol" w:hint="default"/>
-      </w:rPr>
-    </w:lvl>
-    <w:lvl w:ilvl="7" w:tplc="040C0003" w:tentative="1">
-      <w:start w:val="1"/>
-      <w:numFmt w:val="bullet"/>
-      <w:lvlText w:val="o"/>
-      <w:lvlJc w:val="left"/>
-      <w:pPr>
-        <w:ind w:left="7178" w:hanging="360"/>
-      </w:pPr>
-      <w:rPr>
-        <w:rFonts w:ascii="Courier New" w:hAnsi="Courier New" w:cs="Courier New" w:hint="default"/>
-      </w:rPr>
-    </w:lvl>
-    <w:lvl w:ilvl="8" w:tplc="040C0005" w:tentative="1">
-      <w:start w:val="1"/>
-      <w:numFmt w:val="bullet"/>
-      <w:lvlText w:val=""/>
-      <w:lvlJc w:val="left"/>
-      <w:pPr>
-        <w:ind w:left="7898" w:hanging="360"/>
-      </w:pPr>
-      <w:rPr>
-        <w:rFonts w:ascii="Wingdings" w:hAnsi="Wingdings" w:hint="default"/>
-      </w:rPr>
-    </w:lvl>
-  </w:abstractNum>
-  <w:abstractNum w:abstractNumId="2" w15:restartNumberingAfterBreak="0">
-    <w:nsid w:val="7FC91501"/>
-    <w:multiLevelType w:val="hybridMultilevel"/>
-    <w:tmpl w:val="E4820B72"/>
-    <w:lvl w:ilvl="0" w:tplc="040C0001">
-      <w:start w:val="1"/>
-      <w:numFmt w:val="bullet"/>
-      <w:lvlText w:val=""/>
-      <w:lvlJc w:val="left"/>
-      <w:pPr>
-        <w:ind w:left="2138" w:hanging="360"/>
-      </w:pPr>
-      <w:rPr>
-        <w:rFonts w:ascii="Symbol" w:hAnsi="Symbol" w:hint="default"/>
-      </w:rPr>
-    </w:lvl>
-    <w:lvl w:ilvl="1" w:tplc="040C0003" w:tentative="1">
-      <w:start w:val="1"/>
-      <w:numFmt w:val="bullet"/>
-      <w:lvlText w:val="o"/>
-      <w:lvlJc w:val="left"/>
-      <w:pPr>
-        <w:ind w:left="2858" w:hanging="360"/>
-      </w:pPr>
-      <w:rPr>
-        <w:rFonts w:ascii="Courier New" w:hAnsi="Courier New" w:cs="Courier New" w:hint="default"/>
-      </w:rPr>
-    </w:lvl>
-    <w:lvl w:ilvl="2" w:tplc="040C0005" w:tentative="1">
-      <w:start w:val="1"/>
-      <w:numFmt w:val="bullet"/>
-      <w:lvlText w:val=""/>
-      <w:lvlJc w:val="left"/>
-      <w:pPr>
-        <w:ind w:left="3578" w:hanging="360"/>
-      </w:pPr>
-      <w:rPr>
-        <w:rFonts w:ascii="Wingdings" w:hAnsi="Wingdings" w:hint="default"/>
-      </w:rPr>
-    </w:lvl>
-    <w:lvl w:ilvl="3" w:tplc="040C0001" w:tentative="1">
-      <w:start w:val="1"/>
-      <w:numFmt w:val="bullet"/>
-      <w:lvlText w:val=""/>
-      <w:lvlJc w:val="left"/>
-      <w:pPr>
-        <w:ind w:left="4298" w:hanging="360"/>
-      </w:pPr>
-      <w:rPr>
-        <w:rFonts w:ascii="Symbol" w:hAnsi="Symbol" w:hint="default"/>
-      </w:rPr>
-    </w:lvl>
-    <w:lvl w:ilvl="4" w:tplc="040C0003" w:tentative="1">
-      <w:start w:val="1"/>
-      <w:numFmt w:val="bullet"/>
-      <w:lvlText w:val="o"/>
-      <w:lvlJc w:val="left"/>
-      <w:pPr>
-        <w:ind w:left="5018" w:hanging="360"/>
-      </w:pPr>
-      <w:rPr>
-        <w:rFonts w:ascii="Courier New" w:hAnsi="Courier New" w:cs="Courier New" w:hint="default"/>
-      </w:rPr>
-    </w:lvl>
-    <w:lvl w:ilvl="5" w:tplc="040C0005" w:tentative="1">
-      <w:start w:val="1"/>
-      <w:numFmt w:val="bullet"/>
-      <w:lvlText w:val=""/>
-      <w:lvlJc w:val="left"/>
-      <w:pPr>
-        <w:ind w:left="5738" w:hanging="360"/>
-      </w:pPr>
-      <w:rPr>
-        <w:rFonts w:ascii="Wingdings" w:hAnsi="Wingdings" w:hint="default"/>
-      </w:rPr>
-    </w:lvl>
-    <w:lvl w:ilvl="6" w:tplc="040C0001" w:tentative="1">
-      <w:start w:val="1"/>
-      <w:numFmt w:val="bullet"/>
-      <w:lvlText w:val=""/>
-      <w:lvlJc w:val="left"/>
-      <w:pPr>
-        <w:ind w:left="6458" w:hanging="360"/>
-      </w:pPr>
-      <w:rPr>
-        <w:rFonts w:ascii="Symbol" w:hAnsi="Symbol" w:hint="default"/>
-      </w:rPr>
-    </w:lvl>
-    <w:lvl w:ilvl="7" w:tplc="040C0003" w:tentative="1">
-      <w:start w:val="1"/>
-      <w:numFmt w:val="bullet"/>
-      <w:lvlText w:val="o"/>
-      <w:lvlJc w:val="left"/>
-      <w:pPr>
-        <w:ind w:left="7178" w:hanging="360"/>
-      </w:pPr>
-      <w:rPr>
-        <w:rFonts w:ascii="Courier New" w:hAnsi="Courier New" w:cs="Courier New" w:hint="default"/>
-      </w:rPr>
-    </w:lvl>
-    <w:lvl w:ilvl="8" w:tplc="040C0005" w:tentative="1">
-      <w:start w:val="1"/>
-      <w:numFmt w:val="bullet"/>
-      <w:lvlText w:val=""/>
-      <w:lvlJc w:val="left"/>
-      <w:pPr>
-        <w:ind w:left="7898" w:hanging="360"/>
-      </w:pPr>
-      <w:rPr>
-        <w:rFonts w:ascii="Wingdings" w:hAnsi="Wingdings" w:hint="default"/>
-      </w:rPr>
-    </w:lvl>
-  </w:abstractNum>
-  <w:num w:numId="1">
-    <w:abstractNumId w:val="2"/>
-  </w:num>
-  <w:num w:numId="2">
-    <w:abstractNumId w:val="1"/>
-  </w:num>
-  <w:num w:numId="3">
-    <w:abstractNumId w:val="0"/>
-  </w:num>
-</w:numbering>
+      <w:drawing>
+        <wp:inline distT="0" distB="0" distL="0" distR="0" wp14:anchorId="0D138F1F" wp14:editId="42664DD6">
+          <wp:extent cx="7560945" cy="1371255"/>
+          <wp:effectExtent l="0" t="0" r="1905" b="635"/>
+          <wp:docPr id="5" name="Image 5"/>
+          <wp:cNvGraphicFramePr>
+            <a:graphicFrameLocks xmlns:a="http://schemas.openxmlformats.org/drawingml/2006/main" noChangeAspect="1"/>
+          </wp:cNvGraphicFramePr>
+          <a:graphic xmlns:a="http://schemas.openxmlformats.org/drawingml/2006/main">
+            <a:graphicData uri="http://schemas.openxmlformats.org/drawingml/2006/picture">
+              <pic:pic xmlns:pic="http://schemas.openxmlformats.org/drawingml/2006/picture">
+                <pic:nvPicPr>
+                  <pic:cNvPr id="0" name="Image 2"/>
+                  <pic:cNvPicPr>
+                    <a:picLocks noChangeAspect="1" noChangeArrowheads="1"/>
+                  </pic:cNvPicPr>
+                </pic:nvPicPr>
+                <pic:blipFill>
+                  <a:blip r:embed="rId1" cstate="print">
+                    <a:extLst>
+                      <a:ext uri="{28A0092B-C50C-407E-A947-70E740481C1C}">
+                        <a14:useLocalDpi xmlns:a14="http://schemas.microsoft.com/office/drawing/2010/main" val="0"/>
+                      </a:ext>
+                    </a:extLst>
+                  </a:blip>
+                  <a:srcRect/>
+                  <a:stretch>
+                    <a:fillRect/>
+                  </a:stretch>
+                </pic:blipFill>
+                <pic:spPr bwMode="auto">
+                  <a:xfrm>
+                    <a:off x="0" y="0"/>
+                    <a:ext cx="7560945" cy="1371255"/>
+                  </a:xfrm>
+                  <a:prstGeom prst="rect">
+                    <a:avLst/>
+                  </a:prstGeom>
+                  <a:noFill/>
+                  <a:ln>
+                    <a:noFill/>
+                  </a:ln>
+                </pic:spPr>
+              </pic:pic>
+            </a:graphicData>
+          </a:graphic>
+        </wp:inline>
+      </w:drawing>
+    </w:r>
+  </w:p>
+</w:hdr>
 </file>
 
 <file path=word/styles.xml><?xml version="1.0" encoding="utf-8"?>
@@ -1793,7 +1435,7 @@
     <w:lsdException w:name="Closing" w:semiHidden="1" w:unhideWhenUsed="1"/>
     <w:lsdException w:name="Signature" w:semiHidden="1" w:unhideWhenUsed="1"/>
     <w:lsdException w:name="Default Paragraph Font" w:semiHidden="1" w:uiPriority="1" w:unhideWhenUsed="1"/>
-    <w:lsdException w:name="Body Text" w:semiHidden="1" w:unhideWhenUsed="1"/>
+    <w:lsdException w:name="Body Text" w:semiHidden="1" w:uiPriority="0" w:unhideWhenUsed="1"/>
     <w:lsdException w:name="Body Text Indent" w:semiHidden="1" w:unhideWhenUsed="1"/>
     <w:lsdException w:name="List Continue" w:semiHidden="1" w:unhideWhenUsed="1"/>
     <w:lsdException w:name="List Continue 2" w:semiHidden="1" w:unhideWhenUsed="1"/>
@@ -2160,6 +1802,7 @@
   <w:style w:type="paragraph" w:styleId="Corpsdetexte">
     <w:name w:val="Body Text"/>
     <w:basedOn w:val="Normal"/>
+    <w:link w:val="CorpsdetexteCar"/>
     <w:semiHidden/>
     <w:pPr>
       <w:overflowPunct w:val="0"/>
@@ -2315,13 +1958,24 @@
       <w:lang w:eastAsia="fr-FR"/>
     </w:rPr>
   </w:style>
+  <w:style w:type="character" w:customStyle="1" w:styleId="CorpsdetexteCar">
+    <w:name w:val="Corps de texte Car"/>
+    <w:link w:val="Corpsdetexte"/>
+    <w:semiHidden/>
+    <w:rsid w:val="007A33D5"/>
+    <w:rPr>
+      <w:rFonts w:ascii="Book Antiqua" w:hAnsi="Book Antiqua"/>
+      <w:sz w:val="24"/>
+      <w:lang w:eastAsia="fr-FR"/>
+    </w:rPr>
+  </w:style>
   <w:style w:type="character" w:styleId="Marquedecommentaire">
     <w:name w:val="annotation reference"/>
     <w:basedOn w:val="Policepardfaut"/>
     <w:uiPriority w:val="99"/>
     <w:semiHidden/>
     <w:unhideWhenUsed/>
-    <w:rsid w:val="00795445"/>
+    <w:rsid w:val="00FF6B21"/>
     <w:rPr>
       <w:sz w:val="16"/>
       <w:szCs w:val="16"/>
@@ -2334,7 +1988,7 @@
     <w:uiPriority w:val="99"/>
     <w:semiHidden/>
     <w:unhideWhenUsed/>
-    <w:rsid w:val="00795445"/>
+    <w:rsid w:val="00FF6B21"/>
   </w:style>
   <w:style w:type="character" w:customStyle="1" w:styleId="CommentaireCar">
     <w:name w:val="Commentaire Car"/>
@@ -2342,7 +1996,7 @@
     <w:link w:val="Commentaire"/>
     <w:uiPriority w:val="99"/>
     <w:semiHidden/>
-    <w:rsid w:val="00795445"/>
+    <w:rsid w:val="00FF6B21"/>
     <w:rPr>
       <w:lang w:eastAsia="fr-FR"/>
     </w:rPr>
@@ -2355,7 +2009,7 @@
     <w:uiPriority w:val="99"/>
     <w:semiHidden/>
     <w:unhideWhenUsed/>
-    <w:rsid w:val="00795445"/>
+    <w:rsid w:val="00FF6B21"/>
     <w:rPr>
       <w:b/>
       <w:bCs/>
@@ -2367,31 +2021,19 @@
     <w:link w:val="Objetducommentaire"/>
     <w:uiPriority w:val="99"/>
     <w:semiHidden/>
-    <w:rsid w:val="00795445"/>
+    <w:rsid w:val="00FF6B21"/>
     <w:rPr>
       <w:b/>
       <w:bCs/>
       <w:lang w:eastAsia="fr-FR"/>
     </w:rPr>
   </w:style>
-  <w:style w:type="paragraph" w:styleId="Paragraphedeliste">
-    <w:name w:val="List Paragraph"/>
-    <w:basedOn w:val="Normal"/>
-    <w:uiPriority w:val="34"/>
-    <w:qFormat/>
-    <w:rsid w:val="00831067"/>
-    <w:pPr>
-      <w:ind w:left="720"/>
-      <w:contextualSpacing/>
-    </w:pPr>
-  </w:style>
   <w:style w:type="table" w:styleId="Grilledutableau">
     <w:name w:val="Table Grid"/>
     <w:basedOn w:val="TableauNormal"/>
     <w:uiPriority w:val="59"/>
-    <w:rsid w:val="00641F55"/>
+    <w:rsid w:val="007F7C99"/>
     <w:tblPr>
-      <w:tblInd w:w="0" w:type="nil"/>
       <w:tblBorders>
         <w:top w:val="single" w:sz="4" w:space="0" w:color="auto"/>
         <w:left w:val="single" w:sz="4" w:space="0" w:color="auto"/>
@@ -2401,6 +2043,18 @@
         <w:insideV w:val="single" w:sz="4" w:space="0" w:color="auto"/>
       </w:tblBorders>
     </w:tblPr>
+  </w:style>
+  <w:style w:type="character" w:styleId="Lienhypertexte">
+    <w:name w:val="Hyperlink"/>
+    <w:basedOn w:val="Policepardfaut"/>
+    <w:uiPriority w:val="99"/>
+    <w:semiHidden/>
+    <w:unhideWhenUsed/>
+    <w:rsid w:val="00316C13"/>
+    <w:rPr>
+      <w:color w:val="0000FF"/>
+      <w:u w:val="single"/>
+    </w:rPr>
   </w:style>
 </w:styles>
 </file>
@@ -2688,4 +2342,16 @@
   <a:objectDefaults/>
   <a:extraClrSchemeLst/>
 </a:theme>
+</file>
+
+<file path=customXml/item1.xml><?xml version="1.0" encoding="utf-8"?>
+<b:Sources xmlns:b="http://schemas.openxmlformats.org/officeDocument/2006/bibliography" xmlns="http://schemas.openxmlformats.org/officeDocument/2006/bibliography" SelectedStyle="\APA.XSL" StyleName="APA"/>
+</file>
+
+<file path=customXml/itemProps1.xml><?xml version="1.0" encoding="utf-8"?>
+<ds:datastoreItem xmlns:ds="http://schemas.openxmlformats.org/officeDocument/2006/customXml" ds:itemID="{23E3570D-06F9-498C-8C13-47BCCE44D4FA}">
+  <ds:schemaRefs>
+    <ds:schemaRef ds:uri="http://schemas.openxmlformats.org/officeDocument/2006/bibliography"/>
+  </ds:schemaRefs>
+</ds:datastoreItem>
 </file>
</xml_diff>